<commit_message>
v0.9.0: solapas 4-Actuador, 5-Posicionador y 6-Accesorios
Fuerza (desbalance + asiento + empaquetadura) y par de cierre, resorte y banco,
tamaños genéricos de actuador, verificación de vástago, aire y volante; bloqueo
de señales del posicionador por presión; coherencia de solenoide y accesorios;
secciones nuevas en hoja de datos, memoria e informe; ayuda en español.

Co-Authored-By: Claude Opus 5.5 (1M context) <noreply@anthropic.com>
Claude-Session: https://claude.ai/code/session_01U4yJ7uLSXttFganqs6AWmH
</commit_message>
<xml_diff>
--- a/kit_workshop/resultados_de_referencia/Caso_A_baja_agua_enfriamiento_mariposa_resultados_N25.docx
+++ b/kit_workshop/resultados_de_referencia/Caso_A_baja_agua_enfriamiento_mariposa_resultados_N25.docx
@@ -6752,7 +6752,1141 @@
         <w:pStyle w:val="Heading2"/>
       </w:pPr>
       <w:r>
-        <w:t>6. Conclusión</w:t>
+        <w:t>6. Actuador, posicionador y accesorios</w:t>
+      </w:r>
+    </w:p>
+    <w:p>
+      <w:r>
+        <w:t>Método de pares para válvulas rotativas: par de arranque TB = A·ΔP_cierre + B y par dinámico TD = C(θ)·ΔPef, con ΔPef = mín(ΔP, ΔP bloqueada) de cada caso y C interpolado en el ángulo de apertura. Se dimensiona con el mayor de ambos por un margen de 1,25.</w:t>
+      </w:r>
+    </w:p>
+    <w:tbl>
+      <w:tblPr>
+        <w:tblStyle w:val="TableGrid"/>
+        <w:tblW w:type="auto" w:w="0"/>
+        <w:jc w:val="center"/>
+        <w:tblLayout w:type="fixed"/>
+        <w:tblLook w:firstColumn="1" w:firstRow="1" w:lastColumn="0" w:lastRow="0" w:noHBand="0" w:noVBand="1" w:val="04A0"/>
+      </w:tblPr>
+      <w:tblGrid>
+        <w:gridCol w:w="3289"/>
+        <w:gridCol w:w="3289"/>
+        <w:gridCol w:w="3289"/>
+      </w:tblGrid>
+      <w:tr>
+        <w:tc>
+          <w:tcPr>
+            <w:tcW w:type="dxa" w:w="2959"/>
+            <w:shd w:val="clear" w:color="auto" w:fill="0D3B66"/>
+          </w:tcPr>
+          <w:p>
+            <w:r>
+              <w:rPr>
+                <w:b/>
+                <w:color w:val="FFFFFF"/>
+                <w:sz w:val="18"/>
+              </w:rPr>
+              <w:t>Componente</w:t>
+            </w:r>
+          </w:p>
+        </w:tc>
+        <w:tc>
+          <w:tcPr>
+            <w:tcW w:type="dxa" w:w="2466"/>
+            <w:shd w:val="clear" w:color="auto" w:fill="0D3B66"/>
+          </w:tcPr>
+          <w:p>
+            <w:r>
+              <w:rPr>
+                <w:b/>
+                <w:color w:val="FFFFFF"/>
+                <w:sz w:val="18"/>
+              </w:rPr>
+              <w:t>Valor</w:t>
+            </w:r>
+          </w:p>
+        </w:tc>
+        <w:tc>
+          <w:tcPr>
+            <w:tcW w:type="dxa" w:w="4439"/>
+            <w:shd w:val="clear" w:color="auto" w:fill="0D3B66"/>
+          </w:tcPr>
+          <w:p>
+            <w:r>
+              <w:rPr>
+                <w:b/>
+                <w:color w:val="FFFFFF"/>
+                <w:sz w:val="18"/>
+              </w:rPr>
+              <w:t>Fórmula / base</w:t>
+            </w:r>
+          </w:p>
+        </w:tc>
+      </w:tr>
+      <w:tr>
+        <w:tc>
+          <w:tcPr>
+            <w:tcW w:type="dxa" w:w="2959"/>
+          </w:tcPr>
+          <w:p>
+            <w:r>
+              <w:rPr>
+                <w:sz w:val="18"/>
+              </w:rPr>
+              <w:t>A (factor de presión)</w:t>
+            </w:r>
+          </w:p>
+        </w:tc>
+        <w:tc>
+          <w:tcPr>
+            <w:tcW w:type="dxa" w:w="2466"/>
+          </w:tcPr>
+          <w:p>
+            <w:r>
+              <w:rPr>
+                <w:sz w:val="18"/>
+              </w:rPr>
+              <w:t>4,200 lbf·in/psi</w:t>
+            </w:r>
+          </w:p>
+        </w:tc>
+        <w:tc>
+          <w:tcPr>
+            <w:tcW w:type="dxa" w:w="4439"/>
+          </w:tcPr>
+          <w:p>
+            <w:pPr>
+              <w:jc w:val="right"/>
+            </w:pPr>
+            <w:r>
+              <w:rPr>
+                <w:sz w:val="18"/>
+              </w:rPr>
+              <w:t>Mariposa triple excéntrica, asiento metálico</w:t>
+            </w:r>
+          </w:p>
+        </w:tc>
+      </w:tr>
+      <w:tr>
+        <w:tc>
+          <w:tcPr>
+            <w:tcW w:type="dxa" w:w="2959"/>
+          </w:tcPr>
+          <w:p>
+            <w:r>
+              <w:rPr>
+                <w:sz w:val="18"/>
+              </w:rPr>
+              <w:t>B (fricción de asientos, cojinetes y empaquetadura)</w:t>
+            </w:r>
+          </w:p>
+        </w:tc>
+        <w:tc>
+          <w:tcPr>
+            <w:tcW w:type="dxa" w:w="2466"/>
+          </w:tcPr>
+          <w:p>
+            <w:r>
+              <w:rPr>
+                <w:sz w:val="18"/>
+              </w:rPr>
+              <w:t>113 N·m (998 lbf·in)</w:t>
+            </w:r>
+          </w:p>
+        </w:tc>
+        <w:tc>
+          <w:tcPr>
+            <w:tcW w:type="dxa" w:w="4439"/>
+          </w:tcPr>
+          <w:p>
+            <w:pPr>
+              <w:jc w:val="right"/>
+            </w:pPr>
+            <w:r>
+              <w:rPr>
+                <w:sz w:val="18"/>
+              </w:rPr>
+            </w:r>
+          </w:p>
+        </w:tc>
+      </w:tr>
+      <w:tr>
+        <w:tc>
+          <w:tcPr>
+            <w:tcW w:type="dxa" w:w="2959"/>
+          </w:tcPr>
+          <w:p>
+            <w:r>
+              <w:rPr>
+                <w:sz w:val="18"/>
+              </w:rPr>
+              <w:t>TB, par de arranque</w:t>
+            </w:r>
+          </w:p>
+        </w:tc>
+        <w:tc>
+          <w:tcPr>
+            <w:tcW w:type="dxa" w:w="2466"/>
+          </w:tcPr>
+          <w:p>
+            <w:r>
+              <w:rPr>
+                <w:sz w:val="18"/>
+              </w:rPr>
+              <w:t>160 N·m (1.412 lbf·in)</w:t>
+            </w:r>
+          </w:p>
+        </w:tc>
+        <w:tc>
+          <w:tcPr>
+            <w:tcW w:type="dxa" w:w="4439"/>
+          </w:tcPr>
+          <w:p>
+            <w:pPr>
+              <w:jc w:val="right"/>
+            </w:pPr>
+            <w:r>
+              <w:rPr>
+                <w:sz w:val="18"/>
+              </w:rPr>
+              <w:t>A·ΔP_cierre + B = 4,200·98,6 + 998</w:t>
+            </w:r>
+          </w:p>
+        </w:tc>
+      </w:tr>
+      <w:tr>
+        <w:tc>
+          <w:tcPr>
+            <w:tcW w:type="dxa" w:w="2959"/>
+          </w:tcPr>
+          <w:p>
+            <w:r>
+              <w:rPr>
+                <w:sz w:val="18"/>
+              </w:rPr>
+              <w:t>TD, par dinámico máximo</w:t>
+            </w:r>
+          </w:p>
+        </w:tc>
+        <w:tc>
+          <w:tcPr>
+            <w:tcW w:type="dxa" w:w="2466"/>
+          </w:tcPr>
+          <w:p>
+            <w:r>
+              <w:rPr>
+                <w:sz w:val="18"/>
+              </w:rPr>
+              <w:t>85 N·m (748 lbf·in)</w:t>
+            </w:r>
+          </w:p>
+        </w:tc>
+        <w:tc>
+          <w:tcPr>
+            <w:tcW w:type="dxa" w:w="4439"/>
+          </w:tcPr>
+          <w:p>
+            <w:pPr>
+              <w:jc w:val="right"/>
+            </w:pPr>
+            <w:r>
+              <w:rPr>
+                <w:sz w:val="18"/>
+              </w:rPr>
+              <w:t>C(θ)·ΔPef, caso Máximo (48°, ΔPef 14,5 psi)</w:t>
+            </w:r>
+          </w:p>
+        </w:tc>
+      </w:tr>
+      <w:tr>
+        <w:tc>
+          <w:tcPr>
+            <w:tcW w:type="dxa" w:w="2959"/>
+          </w:tcPr>
+          <w:p>
+            <w:r>
+              <w:rPr>
+                <w:sz w:val="18"/>
+              </w:rPr>
+              <w:t>Par requerido con margen 1,25</w:t>
+            </w:r>
+          </w:p>
+        </w:tc>
+        <w:tc>
+          <w:tcPr>
+            <w:tcW w:type="dxa" w:w="2466"/>
+          </w:tcPr>
+          <w:p>
+            <w:r>
+              <w:rPr>
+                <w:sz w:val="18"/>
+              </w:rPr>
+              <w:t>199 N·m (1.765 lbf·in)</w:t>
+            </w:r>
+          </w:p>
+        </w:tc>
+        <w:tc>
+          <w:tcPr>
+            <w:tcW w:type="dxa" w:w="4439"/>
+          </w:tcPr>
+          <w:p>
+            <w:pPr>
+              <w:jc w:val="right"/>
+            </w:pPr>
+            <w:r>
+              <w:rPr>
+                <w:sz w:val="18"/>
+              </w:rPr>
+              <w:t>máx(TB, TD) × 1,25</w:t>
+            </w:r>
+          </w:p>
+        </w:tc>
+      </w:tr>
+    </w:tbl>
+    <w:p/>
+    <w:tbl>
+      <w:tblPr>
+        <w:tblStyle w:val="TableGrid"/>
+        <w:tblW w:type="auto" w:w="0"/>
+        <w:jc w:val="center"/>
+        <w:tblLayout w:type="fixed"/>
+        <w:tblLook w:firstColumn="1" w:firstRow="1" w:lastColumn="0" w:lastRow="0" w:noHBand="0" w:noVBand="1" w:val="04A0"/>
+      </w:tblPr>
+      <w:tblGrid>
+        <w:gridCol w:w="3289"/>
+        <w:gridCol w:w="3289"/>
+        <w:gridCol w:w="3289"/>
+      </w:tblGrid>
+      <w:tr>
+        <w:tc>
+          <w:tcPr>
+            <w:tcW w:type="dxa" w:w="2762"/>
+            <w:shd w:val="clear" w:color="auto" w:fill="0D3B66"/>
+          </w:tcPr>
+          <w:p>
+            <w:r>
+              <w:rPr>
+                <w:b/>
+                <w:color w:val="FFFFFF"/>
+                <w:sz w:val="18"/>
+              </w:rPr>
+              <w:t>Paso</w:t>
+            </w:r>
+          </w:p>
+        </w:tc>
+        <w:tc>
+          <w:tcPr>
+            <w:tcW w:type="dxa" w:w="4636"/>
+            <w:shd w:val="clear" w:color="auto" w:fill="0D3B66"/>
+          </w:tcPr>
+          <w:p>
+            <w:r>
+              <w:rPr>
+                <w:b/>
+                <w:color w:val="FFFFFF"/>
+                <w:sz w:val="18"/>
+              </w:rPr>
+              <w:t>Ecuación</w:t>
+            </w:r>
+          </w:p>
+        </w:tc>
+        <w:tc>
+          <w:tcPr>
+            <w:tcW w:type="dxa" w:w="2466"/>
+            <w:shd w:val="clear" w:color="auto" w:fill="0D3B66"/>
+          </w:tcPr>
+          <w:p>
+            <w:r>
+              <w:rPr>
+                <w:b/>
+                <w:color w:val="FFFFFF"/>
+                <w:sz w:val="18"/>
+              </w:rPr>
+              <w:t>Resultado</w:t>
+            </w:r>
+          </w:p>
+        </w:tc>
+      </w:tr>
+      <w:tr>
+        <w:tc>
+          <w:tcPr>
+            <w:tcW w:type="dxa" w:w="2762"/>
+          </w:tcPr>
+          <w:p>
+            <w:r>
+              <w:rPr>
+                <w:sz w:val="18"/>
+              </w:rPr>
+              <w:t>Par de arranque</w:t>
+            </w:r>
+          </w:p>
+        </w:tc>
+        <w:tc>
+          <w:tcPr>
+            <w:tcW w:type="dxa" w:w="4636"/>
+          </w:tcPr>
+          <w:p>
+            <w:r>
+              <w:rPr>
+                <w:sz w:val="18"/>
+              </w:rPr>
+              <w:t>TB = A·ΔP_cierre + B</w:t>
+            </w:r>
+          </w:p>
+        </w:tc>
+        <w:tc>
+          <w:tcPr>
+            <w:tcW w:type="dxa" w:w="2466"/>
+          </w:tcPr>
+          <w:p>
+            <w:pPr>
+              <w:jc w:val="right"/>
+            </w:pPr>
+            <w:r>
+              <w:rPr>
+                <w:sz w:val="18"/>
+              </w:rPr>
+              <w:t>160 N·m (1.412 lbf·in)</w:t>
+            </w:r>
+          </w:p>
+        </w:tc>
+      </w:tr>
+      <w:tr>
+        <w:tc>
+          <w:tcPr>
+            <w:tcW w:type="dxa" w:w="2762"/>
+          </w:tcPr>
+          <w:p>
+            <w:r>
+              <w:rPr>
+                <w:sz w:val="18"/>
+              </w:rPr>
+              <w:t>Par dinámico</w:t>
+            </w:r>
+          </w:p>
+        </w:tc>
+        <w:tc>
+          <w:tcPr>
+            <w:tcW w:type="dxa" w:w="4636"/>
+          </w:tcPr>
+          <w:p>
+            <w:r>
+              <w:rPr>
+                <w:sz w:val="18"/>
+              </w:rPr>
+              <w:t>TD = C(θ)·ΔPef (ΔPef = mín(ΔP, ΔP bloqueada))</w:t>
+            </w:r>
+          </w:p>
+        </w:tc>
+        <w:tc>
+          <w:tcPr>
+            <w:tcW w:type="dxa" w:w="2466"/>
+          </w:tcPr>
+          <w:p>
+            <w:pPr>
+              <w:jc w:val="right"/>
+            </w:pPr>
+            <w:r>
+              <w:rPr>
+                <w:sz w:val="18"/>
+              </w:rPr>
+              <w:t>85 N·m (748 lbf·in)</w:t>
+            </w:r>
+          </w:p>
+        </w:tc>
+      </w:tr>
+      <w:tr>
+        <w:tc>
+          <w:tcPr>
+            <w:tcW w:type="dxa" w:w="2762"/>
+          </w:tcPr>
+          <w:p>
+            <w:r>
+              <w:rPr>
+                <w:sz w:val="18"/>
+              </w:rPr>
+              <w:t>Par requerido</w:t>
+            </w:r>
+          </w:p>
+        </w:tc>
+        <w:tc>
+          <w:tcPr>
+            <w:tcW w:type="dxa" w:w="4636"/>
+          </w:tcPr>
+          <w:p>
+            <w:r>
+              <w:rPr>
+                <w:sz w:val="18"/>
+              </w:rPr>
+              <w:t>T = máx(TB, TD) × 1,25</w:t>
+            </w:r>
+          </w:p>
+        </w:tc>
+        <w:tc>
+          <w:tcPr>
+            <w:tcW w:type="dxa" w:w="2466"/>
+          </w:tcPr>
+          <w:p>
+            <w:pPr>
+              <w:jc w:val="right"/>
+            </w:pPr>
+            <w:r>
+              <w:rPr>
+                <w:sz w:val="18"/>
+              </w:rPr>
+              <w:t>199 N·m (1.765 lbf·in)</w:t>
+            </w:r>
+          </w:p>
+        </w:tc>
+      </w:tr>
+    </w:tbl>
+    <w:p/>
+    <w:tbl>
+      <w:tblPr>
+        <w:tblStyle w:val="TableGrid"/>
+        <w:tblW w:type="auto" w:w="0"/>
+        <w:jc w:val="center"/>
+        <w:tblLayout w:type="fixed"/>
+        <w:tblLook w:firstColumn="1" w:firstRow="1" w:lastColumn="0" w:lastRow="0" w:noHBand="0" w:noVBand="1" w:val="04A0"/>
+      </w:tblPr>
+      <w:tblGrid>
+        <w:gridCol w:w="4933"/>
+        <w:gridCol w:w="4933"/>
+      </w:tblGrid>
+      <w:tr>
+        <w:tc>
+          <w:tcPr>
+            <w:tcW w:type="dxa" w:w="3453"/>
+            <w:shd w:val="clear" w:color="auto" w:fill="0D3B66"/>
+          </w:tcPr>
+          <w:p>
+            <w:r>
+              <w:rPr>
+                <w:b/>
+                <w:color w:val="FFFFFF"/>
+                <w:sz w:val="18"/>
+              </w:rPr>
+              <w:t>Dato / resultado</w:t>
+            </w:r>
+          </w:p>
+        </w:tc>
+        <w:tc>
+          <w:tcPr>
+            <w:tcW w:type="dxa" w:w="6412"/>
+            <w:shd w:val="clear" w:color="auto" w:fill="0D3B66"/>
+          </w:tcPr>
+          <w:p>
+            <w:r>
+              <w:rPr>
+                <w:b/>
+                <w:color w:val="FFFFFF"/>
+                <w:sz w:val="18"/>
+              </w:rPr>
+              <w:t>Valor</w:t>
+            </w:r>
+          </w:p>
+        </w:tc>
+      </w:tr>
+      <w:tr>
+        <w:tc>
+          <w:tcPr>
+            <w:tcW w:type="dxa" w:w="3453"/>
+          </w:tcPr>
+          <w:p>
+            <w:r>
+              <w:rPr>
+                <w:sz w:val="18"/>
+              </w:rPr>
+              <w:t>Tipo de actuador</w:t>
+            </w:r>
+          </w:p>
+        </w:tc>
+        <w:tc>
+          <w:tcPr>
+            <w:tcW w:type="dxa" w:w="6412"/>
+          </w:tcPr>
+          <w:p>
+            <w:r>
+              <w:rPr>
+                <w:sz w:val="18"/>
+              </w:rPr>
+              <w:t>Diafragma y resorte</w:t>
+            </w:r>
+          </w:p>
+        </w:tc>
+      </w:tr>
+      <w:tr>
+        <w:tc>
+          <w:tcPr>
+            <w:tcW w:type="dxa" w:w="3453"/>
+          </w:tcPr>
+          <w:p>
+            <w:r>
+              <w:rPr>
+                <w:sz w:val="18"/>
+              </w:rPr>
+              <w:t>Modo de falla</w:t>
+            </w:r>
+          </w:p>
+        </w:tc>
+        <w:tc>
+          <w:tcPr>
+            <w:tcW w:type="dxa" w:w="6412"/>
+          </w:tcPr>
+          <w:p>
+            <w:r>
+              <w:rPr>
+                <w:sz w:val="18"/>
+              </w:rPr>
+              <w:t>Cierra (FC)</w:t>
+            </w:r>
+          </w:p>
+        </w:tc>
+      </w:tr>
+      <w:tr>
+        <w:tc>
+          <w:tcPr>
+            <w:tcW w:type="dxa" w:w="3453"/>
+          </w:tcPr>
+          <w:p>
+            <w:r>
+              <w:rPr>
+                <w:sz w:val="18"/>
+              </w:rPr>
+              <w:t>Volante (mando manual)</w:t>
+            </w:r>
+          </w:p>
+        </w:tc>
+        <w:tc>
+          <w:tcPr>
+            <w:tcW w:type="dxa" w:w="6412"/>
+          </w:tcPr>
+          <w:p>
+            <w:r>
+              <w:rPr>
+                <w:sz w:val="18"/>
+              </w:rPr>
+              <w:t>No</w:t>
+            </w:r>
+          </w:p>
+        </w:tc>
+      </w:tr>
+      <w:tr>
+        <w:tc>
+          <w:tcPr>
+            <w:tcW w:type="dxa" w:w="3453"/>
+          </w:tcPr>
+          <w:p>
+            <w:r>
+              <w:rPr>
+                <w:sz w:val="18"/>
+              </w:rPr>
+              <w:t>Aire de instrumentos disponible</w:t>
+            </w:r>
+          </w:p>
+        </w:tc>
+        <w:tc>
+          <w:tcPr>
+            <w:tcW w:type="dxa" w:w="6412"/>
+          </w:tcPr>
+          <w:p>
+            <w:r>
+              <w:rPr>
+                <w:sz w:val="18"/>
+              </w:rPr>
+              <w:t>4,00 a 7,00 bar g (mínimo a máximo)</w:t>
+            </w:r>
+          </w:p>
+        </w:tc>
+      </w:tr>
+      <w:tr>
+        <w:tc>
+          <w:tcPr>
+            <w:tcW w:type="dxa" w:w="3453"/>
+          </w:tcPr>
+          <w:p>
+            <w:r>
+              <w:rPr>
+                <w:sz w:val="18"/>
+              </w:rPr>
+              <w:t>Selección</w:t>
+            </w:r>
+          </w:p>
+        </w:tc>
+        <w:tc>
+          <w:tcPr>
+            <w:tcW w:type="dxa" w:w="6412"/>
+          </w:tcPr>
+          <w:p>
+            <w:r>
+              <w:rPr>
+                <w:sz w:val="18"/>
+              </w:rPr>
+              <w:t>Diafragma y resorte D-069 con palanca de 50,8 mm (2,000 in): área 445 cm² (69,0 in²)</w:t>
+            </w:r>
+          </w:p>
+        </w:tc>
+      </w:tr>
+      <w:tr>
+        <w:tc>
+          <w:tcPr>
+            <w:tcW w:type="dxa" w:w="3453"/>
+          </w:tcPr>
+          <w:p>
+            <w:r>
+              <w:rPr>
+                <w:sz w:val="18"/>
+              </w:rPr>
+              <w:t>Método</w:t>
+            </w:r>
+          </w:p>
+        </w:tc>
+        <w:tc>
+          <w:tcPr>
+            <w:tcW w:type="dxa" w:w="6412"/>
+          </w:tcPr>
+          <w:p>
+            <w:r>
+              <w:rPr>
+                <w:sz w:val="18"/>
+              </w:rPr>
+              <w:t>Pares de arranque y dinámico de válvula rotativa</w:t>
+            </w:r>
+          </w:p>
+        </w:tc>
+      </w:tr>
+      <w:tr>
+        <w:tc>
+          <w:tcPr>
+            <w:tcW w:type="dxa" w:w="3453"/>
+          </w:tcPr>
+          <w:p>
+            <w:r>
+              <w:rPr>
+                <w:sz w:val="18"/>
+              </w:rPr>
+              <w:t>Ajuste de banco (bench set)</w:t>
+            </w:r>
+          </w:p>
+        </w:tc>
+        <w:tc>
+          <w:tcPr>
+            <w:tcW w:type="dxa" w:w="6412"/>
+          </w:tcPr>
+          <w:p>
+            <w:r>
+              <w:rPr>
+                <w:sz w:val="18"/>
+              </w:rPr>
+              <w:t>15,5 – 32,5 psig (1,07 – 2,24 bar g)</w:t>
+            </w:r>
+          </w:p>
+        </w:tc>
+      </w:tr>
+      <w:tr>
+        <w:tc>
+          <w:tcPr>
+            <w:tcW w:type="dxa" w:w="3453"/>
+          </w:tcPr>
+          <w:p>
+            <w:r>
+              <w:rPr>
+                <w:sz w:val="18"/>
+              </w:rPr>
+              <w:t>Constante del resorte</w:t>
+            </w:r>
+          </w:p>
+        </w:tc>
+        <w:tc>
+          <w:tcPr>
+            <w:tcW w:type="dxa" w:w="6412"/>
+          </w:tcPr>
+          <w:p>
+            <w:r>
+              <w:rPr>
+                <w:sz w:val="18"/>
+              </w:rPr>
+              <w:t>72,6 N/mm (415 lbf/in)</w:t>
+            </w:r>
+          </w:p>
+        </w:tc>
+      </w:tr>
+      <w:tr>
+        <w:tc>
+          <w:tcPr>
+            <w:tcW w:type="dxa" w:w="3453"/>
+          </w:tcPr>
+          <w:p>
+            <w:r>
+              <w:rPr>
+                <w:sz w:val="18"/>
+              </w:rPr>
+              <w:t>Par de falla del resorte en el asiento</w:t>
+            </w:r>
+          </w:p>
+        </w:tc>
+        <w:tc>
+          <w:tcPr>
+            <w:tcW w:type="dxa" w:w="6412"/>
+          </w:tcPr>
+          <w:p>
+            <w:r>
+              <w:rPr>
+                <w:sz w:val="18"/>
+              </w:rPr>
+              <w:t>205 N·m (1.818 lbf·in)</w:t>
+            </w:r>
+          </w:p>
+        </w:tc>
+      </w:tr>
+      <w:tr>
+        <w:tc>
+          <w:tcPr>
+            <w:tcW w:type="dxa" w:w="3453"/>
+          </w:tcPr>
+          <w:p>
+            <w:r>
+              <w:rPr>
+                <w:sz w:val="18"/>
+              </w:rPr>
+              <w:t>Presión de aire requerida</w:t>
+            </w:r>
+          </w:p>
+        </w:tc>
+        <w:tc>
+          <w:tcPr>
+            <w:tcW w:type="dxa" w:w="6412"/>
+          </w:tcPr>
+          <w:p>
+            <w:r>
+              <w:rPr>
+                <w:sz w:val="18"/>
+              </w:rPr>
+              <w:t>3,28 bar g (47,5 psig)</w:t>
+            </w:r>
+          </w:p>
+        </w:tc>
+      </w:tr>
+    </w:tbl>
+    <w:p/>
+    <w:p>
+      <w:pPr>
+        <w:pStyle w:val="Heading3"/>
+      </w:pPr>
+      <w:r>
+        <w:t>Posicionador</w:t>
+      </w:r>
+    </w:p>
+    <w:tbl>
+      <w:tblPr>
+        <w:tblStyle w:val="TableGrid"/>
+        <w:tblW w:type="auto" w:w="0"/>
+        <w:jc w:val="center"/>
+        <w:tblLayout w:type="fixed"/>
+        <w:tblLook w:firstColumn="1" w:firstRow="1" w:lastColumn="0" w:lastRow="0" w:noHBand="0" w:noVBand="1" w:val="04A0"/>
+      </w:tblPr>
+      <w:tblGrid>
+        <w:gridCol w:w="4933"/>
+        <w:gridCol w:w="4933"/>
+      </w:tblGrid>
+      <w:tr>
+        <w:tc>
+          <w:tcPr>
+            <w:tcW w:type="dxa" w:w="3453"/>
+            <w:shd w:val="clear" w:color="auto" w:fill="EEF2F6"/>
+          </w:tcPr>
+          <w:p>
+            <w:r>
+              <w:rPr>
+                <w:b/>
+                <w:sz w:val="18"/>
+              </w:rPr>
+              <w:t>Tag</w:t>
+            </w:r>
+          </w:p>
+        </w:tc>
+        <w:tc>
+          <w:tcPr>
+            <w:tcW w:type="dxa" w:w="6412"/>
+          </w:tcPr>
+          <w:p>
+            <w:r>
+              <w:rPr>
+                <w:sz w:val="18"/>
+              </w:rPr>
+              <w:t>—</w:t>
+            </w:r>
+          </w:p>
+        </w:tc>
+      </w:tr>
+      <w:tr>
+        <w:tc>
+          <w:tcPr>
+            <w:tcW w:type="dxa" w:w="3453"/>
+            <w:shd w:val="clear" w:color="auto" w:fill="EEF2F6"/>
+          </w:tcPr>
+          <w:p>
+            <w:r>
+              <w:rPr>
+                <w:b/>
+                <w:sz w:val="18"/>
+              </w:rPr>
+              <w:t>Tipo</w:t>
+            </w:r>
+          </w:p>
+        </w:tc>
+        <w:tc>
+          <w:tcPr>
+            <w:tcW w:type="dxa" w:w="6412"/>
+          </w:tcPr>
+          <w:p>
+            <w:r>
+              <w:rPr>
+                <w:sz w:val="18"/>
+              </w:rPr>
+              <w:t>Digital-HART</w:t>
+            </w:r>
+          </w:p>
+        </w:tc>
+      </w:tr>
+      <w:tr>
+        <w:tc>
+          <w:tcPr>
+            <w:tcW w:type="dxa" w:w="3453"/>
+            <w:shd w:val="clear" w:color="auto" w:fill="EEF2F6"/>
+          </w:tcPr>
+          <w:p>
+            <w:r>
+              <w:rPr>
+                <w:b/>
+                <w:sz w:val="18"/>
+              </w:rPr>
+              <w:t>Señal de entrada</w:t>
+            </w:r>
+          </w:p>
+        </w:tc>
+        <w:tc>
+          <w:tcPr>
+            <w:tcW w:type="dxa" w:w="6412"/>
+          </w:tcPr>
+          <w:p>
+            <w:r>
+              <w:rPr>
+                <w:sz w:val="18"/>
+              </w:rPr>
+              <w:t>4-20mA dc</w:t>
+            </w:r>
+          </w:p>
+        </w:tc>
+      </w:tr>
+      <w:tr>
+        <w:tc>
+          <w:tcPr>
+            <w:tcW w:type="dxa" w:w="3453"/>
+            <w:shd w:val="clear" w:color="auto" w:fill="EEF2F6"/>
+          </w:tcPr>
+          <w:p>
+            <w:r>
+              <w:rPr>
+                <w:b/>
+                <w:sz w:val="18"/>
+              </w:rPr>
+              <w:t>Acción</w:t>
+            </w:r>
+          </w:p>
+        </w:tc>
+        <w:tc>
+          <w:tcPr>
+            <w:tcW w:type="dxa" w:w="6412"/>
+          </w:tcPr>
+          <w:p>
+            <w:r>
+              <w:rPr>
+                <w:sz w:val="18"/>
+              </w:rPr>
+              <w:t>Configurable</w:t>
+            </w:r>
+          </w:p>
+        </w:tc>
+      </w:tr>
+      <w:tr>
+        <w:tc>
+          <w:tcPr>
+            <w:tcW w:type="dxa" w:w="3453"/>
+            <w:shd w:val="clear" w:color="auto" w:fill="EEF2F6"/>
+          </w:tcPr>
+          <w:p>
+            <w:r>
+              <w:rPr>
+                <w:b/>
+                <w:sz w:val="18"/>
+              </w:rPr>
+              <w:t>Manómetros</w:t>
+            </w:r>
+          </w:p>
+        </w:tc>
+        <w:tc>
+          <w:tcPr>
+            <w:tcW w:type="dxa" w:w="6412"/>
+          </w:tcPr>
+          <w:p>
+            <w:r>
+              <w:rPr>
+                <w:sz w:val="18"/>
+              </w:rPr>
+              <w:t>Sí</w:t>
+            </w:r>
+          </w:p>
+        </w:tc>
+      </w:tr>
+      <w:tr>
+        <w:tc>
+          <w:tcPr>
+            <w:tcW w:type="dxa" w:w="3453"/>
+            <w:shd w:val="clear" w:color="auto" w:fill="EEF2F6"/>
+          </w:tcPr>
+          <w:p>
+            <w:r>
+              <w:rPr>
+                <w:b/>
+                <w:sz w:val="18"/>
+              </w:rPr>
+              <w:t>Set de aire de instrumentos</w:t>
+            </w:r>
+          </w:p>
+        </w:tc>
+        <w:tc>
+          <w:tcPr>
+            <w:tcW w:type="dxa" w:w="6412"/>
+          </w:tcPr>
+          <w:p>
+            <w:r>
+              <w:rPr>
+                <w:sz w:val="18"/>
+              </w:rPr>
+              <w:t>Sí</w:t>
+            </w:r>
+          </w:p>
+        </w:tc>
+      </w:tr>
+      <w:tr>
+        <w:tc>
+          <w:tcPr>
+            <w:tcW w:type="dxa" w:w="3453"/>
+            <w:shd w:val="clear" w:color="auto" w:fill="EEF2F6"/>
+          </w:tcPr>
+          <w:p>
+            <w:r>
+              <w:rPr>
+                <w:b/>
+                <w:sz w:val="18"/>
+              </w:rPr>
+              <w:t>Salida del set de aire</w:t>
+            </w:r>
+          </w:p>
+        </w:tc>
+        <w:tc>
+          <w:tcPr>
+            <w:tcW w:type="dxa" w:w="6412"/>
+          </w:tcPr>
+          <w:p>
+            <w:r>
+              <w:rPr>
+                <w:sz w:val="18"/>
+              </w:rPr>
+              <w:t>Ajustable 0-80 psi</w:t>
+            </w:r>
+          </w:p>
+        </w:tc>
+      </w:tr>
+      <w:tr>
+        <w:tc>
+          <w:tcPr>
+            <w:tcW w:type="dxa" w:w="3453"/>
+            <w:shd w:val="clear" w:color="auto" w:fill="EEF2F6"/>
+          </w:tcPr>
+          <w:p>
+            <w:r>
+              <w:rPr>
+                <w:b/>
+                <w:sz w:val="18"/>
+              </w:rPr>
+              <w:t>Señales habilitadas</w:t>
+            </w:r>
+          </w:p>
+        </w:tc>
+        <w:tc>
+          <w:tcPr>
+            <w:tcW w:type="dxa" w:w="6412"/>
+          </w:tcPr>
+          <w:p>
+            <w:r>
+              <w:rPr>
+                <w:sz w:val="18"/>
+              </w:rPr>
+              <w:t>4-20mA dc, 4-12mA dc, 12-20mA dc</w:t>
+            </w:r>
+          </w:p>
+        </w:tc>
+      </w:tr>
+    </w:tbl>
+    <w:p/>
+    <w:p>
+      <w:pPr>
+        <w:pStyle w:val="ListBullet"/>
+      </w:pPr>
+      <w:r>
+        <w:t>Foundation FieldBus: no corresponde a un posicionador digital-hart.</w:t>
+      </w:r>
+    </w:p>
+    <w:p>
+      <w:pPr>
+        <w:pStyle w:val="ListBullet"/>
+      </w:pPr>
+      <w:r>
+        <w:t>3-15 psi: no corresponde a un posicionador digital-hart.</w:t>
+      </w:r>
+    </w:p>
+    <w:p>
+      <w:pPr>
+        <w:pStyle w:val="ListBullet"/>
+      </w:pPr>
+      <w:r>
+        <w:t>3-9 psi: no corresponde a un posicionador digital-hart.</w:t>
+      </w:r>
+    </w:p>
+    <w:p>
+      <w:pPr>
+        <w:pStyle w:val="ListBullet"/>
+      </w:pPr>
+      <w:r>
+        <w:t>9-15 psi: no corresponde a un posicionador digital-hart.</w:t>
+      </w:r>
+    </w:p>
+    <w:p>
+      <w:pPr>
+        <w:pStyle w:val="ListBullet"/>
+      </w:pPr>
+      <w:r>
+        <w:t>6-30 psi: no corresponde a un posicionador digital-hart.</w:t>
+      </w:r>
+    </w:p>
+    <w:p>
+      <w:r>
+        <w:rPr>
+          <w:i/>
+          <w:color w:val="55606D"/>
+          <w:sz w:val="17"/>
+        </w:rPr>
+        <w:t>Tamaños de actuador de series genéricas (no corresponden a ningún fabricante). El fabricante confirma el modelo, el resorte y el ajuste de banco.</w:t>
+      </w:r>
+    </w:p>
+    <w:p>
+      <w:pPr>
+        <w:pStyle w:val="Heading2"/>
+      </w:pPr>
+      <w:r>
+        <w:t>7. Conclusión</w:t>
       </w:r>
     </w:p>
     <w:p>
@@ -10044,7 +11178,7 @@
         <w:pStyle w:val="Heading2"/>
       </w:pPr>
       <w:r>
-        <w:t>Actuador y accesorios</w:t>
+        <w:t>Actuador</w:t>
       </w:r>
     </w:p>
     <w:tbl>
@@ -10071,7 +11205,7 @@
                 <w:b/>
                 <w:sz w:val="18"/>
               </w:rPr>
-              <w:t>Actuador</w:t>
+              <w:t>Tipo de actuador</w:t>
             </w:r>
           </w:p>
         </w:tc>
@@ -10084,7 +11218,7 @@
               <w:rPr>
                 <w:sz w:val="18"/>
               </w:rPr>
-              <w:t>A definir (próxima versión: fuerza / par)</w:t>
+              <w:t>Diafragma y resorte</w:t>
             </w:r>
           </w:p>
         </w:tc>
@@ -10101,7 +11235,7 @@
                 <w:b/>
                 <w:sz w:val="18"/>
               </w:rPr>
-              <w:t>Posicionador y accesorios</w:t>
+              <w:t>Modo de falla</w:t>
             </w:r>
           </w:p>
         </w:tc>
@@ -10114,7 +11248,591 @@
               <w:rPr>
                 <w:sz w:val="18"/>
               </w:rPr>
-              <w:t>A definir</w:t>
+              <w:t>Cierra (FC)</w:t>
+            </w:r>
+          </w:p>
+        </w:tc>
+      </w:tr>
+      <w:tr>
+        <w:tc>
+          <w:tcPr>
+            <w:tcW w:type="dxa" w:w="3453"/>
+            <w:shd w:val="clear" w:color="auto" w:fill="EEF2F6"/>
+          </w:tcPr>
+          <w:p>
+            <w:r>
+              <w:rPr>
+                <w:b/>
+                <w:sz w:val="18"/>
+              </w:rPr>
+              <w:t>Volante (mando manual)</w:t>
+            </w:r>
+          </w:p>
+        </w:tc>
+        <w:tc>
+          <w:tcPr>
+            <w:tcW w:type="dxa" w:w="6412"/>
+          </w:tcPr>
+          <w:p>
+            <w:r>
+              <w:rPr>
+                <w:sz w:val="18"/>
+              </w:rPr>
+              <w:t>No</w:t>
+            </w:r>
+          </w:p>
+        </w:tc>
+      </w:tr>
+      <w:tr>
+        <w:tc>
+          <w:tcPr>
+            <w:tcW w:type="dxa" w:w="3453"/>
+            <w:shd w:val="clear" w:color="auto" w:fill="EEF2F6"/>
+          </w:tcPr>
+          <w:p>
+            <w:r>
+              <w:rPr>
+                <w:b/>
+                <w:sz w:val="18"/>
+              </w:rPr>
+              <w:t>Aire de instrumentos disponible</w:t>
+            </w:r>
+          </w:p>
+        </w:tc>
+        <w:tc>
+          <w:tcPr>
+            <w:tcW w:type="dxa" w:w="6412"/>
+          </w:tcPr>
+          <w:p>
+            <w:r>
+              <w:rPr>
+                <w:sz w:val="18"/>
+              </w:rPr>
+              <w:t>4,00 a 7,00 bar g (mínimo a máximo)</w:t>
+            </w:r>
+          </w:p>
+        </w:tc>
+      </w:tr>
+      <w:tr>
+        <w:tc>
+          <w:tcPr>
+            <w:tcW w:type="dxa" w:w="3453"/>
+            <w:shd w:val="clear" w:color="auto" w:fill="EEF2F6"/>
+          </w:tcPr>
+          <w:p>
+            <w:r>
+              <w:rPr>
+                <w:b/>
+                <w:sz w:val="18"/>
+              </w:rPr>
+              <w:t>Selección</w:t>
+            </w:r>
+          </w:p>
+        </w:tc>
+        <w:tc>
+          <w:tcPr>
+            <w:tcW w:type="dxa" w:w="6412"/>
+          </w:tcPr>
+          <w:p>
+            <w:r>
+              <w:rPr>
+                <w:sz w:val="18"/>
+              </w:rPr>
+              <w:t>Diafragma y resorte D-069 con palanca de 50,8 mm (2,000 in): área 445 cm² (69,0 in²)</w:t>
+            </w:r>
+          </w:p>
+        </w:tc>
+      </w:tr>
+      <w:tr>
+        <w:tc>
+          <w:tcPr>
+            <w:tcW w:type="dxa" w:w="3453"/>
+            <w:shd w:val="clear" w:color="auto" w:fill="EEF2F6"/>
+          </w:tcPr>
+          <w:p>
+            <w:r>
+              <w:rPr>
+                <w:b/>
+                <w:sz w:val="18"/>
+              </w:rPr>
+              <w:t>Par requerido (con margen 1,25)</w:t>
+            </w:r>
+          </w:p>
+        </w:tc>
+        <w:tc>
+          <w:tcPr>
+            <w:tcW w:type="dxa" w:w="6412"/>
+          </w:tcPr>
+          <w:p>
+            <w:r>
+              <w:rPr>
+                <w:sz w:val="18"/>
+              </w:rPr>
+              <w:t>199 N·m (1.765 lbf·in)</w:t>
+            </w:r>
+          </w:p>
+        </w:tc>
+      </w:tr>
+      <w:tr>
+        <w:tc>
+          <w:tcPr>
+            <w:tcW w:type="dxa" w:w="3453"/>
+            <w:shd w:val="clear" w:color="auto" w:fill="EEF2F6"/>
+          </w:tcPr>
+          <w:p>
+            <w:r>
+              <w:rPr>
+                <w:b/>
+                <w:sz w:val="18"/>
+              </w:rPr>
+              <w:t>Método</w:t>
+            </w:r>
+          </w:p>
+        </w:tc>
+        <w:tc>
+          <w:tcPr>
+            <w:tcW w:type="dxa" w:w="6412"/>
+          </w:tcPr>
+          <w:p>
+            <w:r>
+              <w:rPr>
+                <w:sz w:val="18"/>
+              </w:rPr>
+              <w:t>Pares de arranque y dinámico de válvula rotativa</w:t>
+            </w:r>
+          </w:p>
+        </w:tc>
+      </w:tr>
+      <w:tr>
+        <w:tc>
+          <w:tcPr>
+            <w:tcW w:type="dxa" w:w="3453"/>
+            <w:shd w:val="clear" w:color="auto" w:fill="EEF2F6"/>
+          </w:tcPr>
+          <w:p>
+            <w:r>
+              <w:rPr>
+                <w:b/>
+                <w:sz w:val="18"/>
+              </w:rPr>
+              <w:t>Ajuste de banco (bench set)</w:t>
+            </w:r>
+          </w:p>
+        </w:tc>
+        <w:tc>
+          <w:tcPr>
+            <w:tcW w:type="dxa" w:w="6412"/>
+          </w:tcPr>
+          <w:p>
+            <w:r>
+              <w:rPr>
+                <w:sz w:val="18"/>
+              </w:rPr>
+              <w:t>15,5 – 32,5 psig (1,07 – 2,24 bar g)</w:t>
+            </w:r>
+          </w:p>
+        </w:tc>
+      </w:tr>
+      <w:tr>
+        <w:tc>
+          <w:tcPr>
+            <w:tcW w:type="dxa" w:w="3453"/>
+            <w:shd w:val="clear" w:color="auto" w:fill="EEF2F6"/>
+          </w:tcPr>
+          <w:p>
+            <w:r>
+              <w:rPr>
+                <w:b/>
+                <w:sz w:val="18"/>
+              </w:rPr>
+              <w:t>Constante del resorte</w:t>
+            </w:r>
+          </w:p>
+        </w:tc>
+        <w:tc>
+          <w:tcPr>
+            <w:tcW w:type="dxa" w:w="6412"/>
+          </w:tcPr>
+          <w:p>
+            <w:r>
+              <w:rPr>
+                <w:sz w:val="18"/>
+              </w:rPr>
+              <w:t>72,6 N/mm (415 lbf/in)</w:t>
+            </w:r>
+          </w:p>
+        </w:tc>
+      </w:tr>
+      <w:tr>
+        <w:tc>
+          <w:tcPr>
+            <w:tcW w:type="dxa" w:w="3453"/>
+            <w:shd w:val="clear" w:color="auto" w:fill="EEF2F6"/>
+          </w:tcPr>
+          <w:p>
+            <w:r>
+              <w:rPr>
+                <w:b/>
+                <w:sz w:val="18"/>
+              </w:rPr>
+              <w:t>Par de falla del resorte en el asiento</w:t>
+            </w:r>
+          </w:p>
+        </w:tc>
+        <w:tc>
+          <w:tcPr>
+            <w:tcW w:type="dxa" w:w="6412"/>
+          </w:tcPr>
+          <w:p>
+            <w:r>
+              <w:rPr>
+                <w:sz w:val="18"/>
+              </w:rPr>
+              <w:t>205 N·m (1.818 lbf·in)</w:t>
+            </w:r>
+          </w:p>
+        </w:tc>
+      </w:tr>
+      <w:tr>
+        <w:tc>
+          <w:tcPr>
+            <w:tcW w:type="dxa" w:w="3453"/>
+            <w:shd w:val="clear" w:color="auto" w:fill="EEF2F6"/>
+          </w:tcPr>
+          <w:p>
+            <w:r>
+              <w:rPr>
+                <w:b/>
+                <w:sz w:val="18"/>
+              </w:rPr>
+              <w:t>Presión de aire requerida</w:t>
+            </w:r>
+          </w:p>
+        </w:tc>
+        <w:tc>
+          <w:tcPr>
+            <w:tcW w:type="dxa" w:w="6412"/>
+          </w:tcPr>
+          <w:p>
+            <w:r>
+              <w:rPr>
+                <w:sz w:val="18"/>
+              </w:rPr>
+              <w:t>3,28 bar g (47,5 psig)</w:t>
+            </w:r>
+          </w:p>
+        </w:tc>
+      </w:tr>
+    </w:tbl>
+    <w:p/>
+    <w:p>
+      <w:pPr>
+        <w:pStyle w:val="Heading2"/>
+      </w:pPr>
+      <w:r>
+        <w:t>Posicionador</w:t>
+      </w:r>
+    </w:p>
+    <w:tbl>
+      <w:tblPr>
+        <w:tblStyle w:val="TableGrid"/>
+        <w:tblW w:type="auto" w:w="0"/>
+        <w:jc w:val="center"/>
+        <w:tblLayout w:type="fixed"/>
+        <w:tblLook w:firstColumn="1" w:firstRow="1" w:lastColumn="0" w:lastRow="0" w:noHBand="0" w:noVBand="1" w:val="04A0"/>
+      </w:tblPr>
+      <w:tblGrid>
+        <w:gridCol w:w="4933"/>
+        <w:gridCol w:w="4933"/>
+      </w:tblGrid>
+      <w:tr>
+        <w:tc>
+          <w:tcPr>
+            <w:tcW w:type="dxa" w:w="3453"/>
+            <w:shd w:val="clear" w:color="auto" w:fill="EEF2F6"/>
+          </w:tcPr>
+          <w:p>
+            <w:r>
+              <w:rPr>
+                <w:b/>
+                <w:sz w:val="18"/>
+              </w:rPr>
+              <w:t>Tag</w:t>
+            </w:r>
+          </w:p>
+        </w:tc>
+        <w:tc>
+          <w:tcPr>
+            <w:tcW w:type="dxa" w:w="6412"/>
+          </w:tcPr>
+          <w:p>
+            <w:r>
+              <w:rPr>
+                <w:sz w:val="18"/>
+              </w:rPr>
+              <w:t>—</w:t>
+            </w:r>
+          </w:p>
+        </w:tc>
+      </w:tr>
+      <w:tr>
+        <w:tc>
+          <w:tcPr>
+            <w:tcW w:type="dxa" w:w="3453"/>
+            <w:shd w:val="clear" w:color="auto" w:fill="EEF2F6"/>
+          </w:tcPr>
+          <w:p>
+            <w:r>
+              <w:rPr>
+                <w:b/>
+                <w:sz w:val="18"/>
+              </w:rPr>
+              <w:t>Tipo</w:t>
+            </w:r>
+          </w:p>
+        </w:tc>
+        <w:tc>
+          <w:tcPr>
+            <w:tcW w:type="dxa" w:w="6412"/>
+          </w:tcPr>
+          <w:p>
+            <w:r>
+              <w:rPr>
+                <w:sz w:val="18"/>
+              </w:rPr>
+              <w:t>Digital-HART</w:t>
+            </w:r>
+          </w:p>
+        </w:tc>
+      </w:tr>
+      <w:tr>
+        <w:tc>
+          <w:tcPr>
+            <w:tcW w:type="dxa" w:w="3453"/>
+            <w:shd w:val="clear" w:color="auto" w:fill="EEF2F6"/>
+          </w:tcPr>
+          <w:p>
+            <w:r>
+              <w:rPr>
+                <w:b/>
+                <w:sz w:val="18"/>
+              </w:rPr>
+              <w:t>Señal de entrada</w:t>
+            </w:r>
+          </w:p>
+        </w:tc>
+        <w:tc>
+          <w:tcPr>
+            <w:tcW w:type="dxa" w:w="6412"/>
+          </w:tcPr>
+          <w:p>
+            <w:r>
+              <w:rPr>
+                <w:sz w:val="18"/>
+              </w:rPr>
+              <w:t>4-20mA dc</w:t>
+            </w:r>
+          </w:p>
+        </w:tc>
+      </w:tr>
+      <w:tr>
+        <w:tc>
+          <w:tcPr>
+            <w:tcW w:type="dxa" w:w="3453"/>
+            <w:shd w:val="clear" w:color="auto" w:fill="EEF2F6"/>
+          </w:tcPr>
+          <w:p>
+            <w:r>
+              <w:rPr>
+                <w:b/>
+                <w:sz w:val="18"/>
+              </w:rPr>
+              <w:t>Acción</w:t>
+            </w:r>
+          </w:p>
+        </w:tc>
+        <w:tc>
+          <w:tcPr>
+            <w:tcW w:type="dxa" w:w="6412"/>
+          </w:tcPr>
+          <w:p>
+            <w:r>
+              <w:rPr>
+                <w:sz w:val="18"/>
+              </w:rPr>
+              <w:t>Configurable</w:t>
+            </w:r>
+          </w:p>
+        </w:tc>
+      </w:tr>
+      <w:tr>
+        <w:tc>
+          <w:tcPr>
+            <w:tcW w:type="dxa" w:w="3453"/>
+            <w:shd w:val="clear" w:color="auto" w:fill="EEF2F6"/>
+          </w:tcPr>
+          <w:p>
+            <w:r>
+              <w:rPr>
+                <w:b/>
+                <w:sz w:val="18"/>
+              </w:rPr>
+              <w:t>Manómetros</w:t>
+            </w:r>
+          </w:p>
+        </w:tc>
+        <w:tc>
+          <w:tcPr>
+            <w:tcW w:type="dxa" w:w="6412"/>
+          </w:tcPr>
+          <w:p>
+            <w:r>
+              <w:rPr>
+                <w:sz w:val="18"/>
+              </w:rPr>
+              <w:t>Sí</w:t>
+            </w:r>
+          </w:p>
+        </w:tc>
+      </w:tr>
+      <w:tr>
+        <w:tc>
+          <w:tcPr>
+            <w:tcW w:type="dxa" w:w="3453"/>
+            <w:shd w:val="clear" w:color="auto" w:fill="EEF2F6"/>
+          </w:tcPr>
+          <w:p>
+            <w:r>
+              <w:rPr>
+                <w:b/>
+                <w:sz w:val="18"/>
+              </w:rPr>
+              <w:t>Set de aire de instrumentos</w:t>
+            </w:r>
+          </w:p>
+        </w:tc>
+        <w:tc>
+          <w:tcPr>
+            <w:tcW w:type="dxa" w:w="6412"/>
+          </w:tcPr>
+          <w:p>
+            <w:r>
+              <w:rPr>
+                <w:sz w:val="18"/>
+              </w:rPr>
+              <w:t>Sí</w:t>
+            </w:r>
+          </w:p>
+        </w:tc>
+      </w:tr>
+      <w:tr>
+        <w:tc>
+          <w:tcPr>
+            <w:tcW w:type="dxa" w:w="3453"/>
+            <w:shd w:val="clear" w:color="auto" w:fill="EEF2F6"/>
+          </w:tcPr>
+          <w:p>
+            <w:r>
+              <w:rPr>
+                <w:b/>
+                <w:sz w:val="18"/>
+              </w:rPr>
+              <w:t>Salida del set de aire</w:t>
+            </w:r>
+          </w:p>
+        </w:tc>
+        <w:tc>
+          <w:tcPr>
+            <w:tcW w:type="dxa" w:w="6412"/>
+          </w:tcPr>
+          <w:p>
+            <w:r>
+              <w:rPr>
+                <w:sz w:val="18"/>
+              </w:rPr>
+              <w:t>Ajustable 0-80 psi</w:t>
+            </w:r>
+          </w:p>
+        </w:tc>
+      </w:tr>
+      <w:tr>
+        <w:tc>
+          <w:tcPr>
+            <w:tcW w:type="dxa" w:w="3453"/>
+            <w:shd w:val="clear" w:color="auto" w:fill="EEF2F6"/>
+          </w:tcPr>
+          <w:p>
+            <w:r>
+              <w:rPr>
+                <w:b/>
+                <w:sz w:val="18"/>
+              </w:rPr>
+              <w:t>Señales habilitadas</w:t>
+            </w:r>
+          </w:p>
+        </w:tc>
+        <w:tc>
+          <w:tcPr>
+            <w:tcW w:type="dxa" w:w="6412"/>
+          </w:tcPr>
+          <w:p>
+            <w:r>
+              <w:rPr>
+                <w:sz w:val="18"/>
+              </w:rPr>
+              <w:t>4-20mA dc, 4-12mA dc, 12-20mA dc</w:t>
+            </w:r>
+          </w:p>
+        </w:tc>
+      </w:tr>
+    </w:tbl>
+    <w:p/>
+    <w:p>
+      <w:pPr>
+        <w:pStyle w:val="Heading2"/>
+      </w:pPr>
+      <w:r>
+        <w:t>Accesorios</w:t>
+      </w:r>
+    </w:p>
+    <w:tbl>
+      <w:tblPr>
+        <w:tblStyle w:val="TableGrid"/>
+        <w:tblW w:type="auto" w:w="0"/>
+        <w:jc w:val="center"/>
+        <w:tblLayout w:type="fixed"/>
+        <w:tblLook w:firstColumn="1" w:firstRow="1" w:lastColumn="0" w:lastRow="0" w:noHBand="0" w:noVBand="1" w:val="04A0"/>
+      </w:tblPr>
+      <w:tblGrid>
+        <w:gridCol w:w="4933"/>
+        <w:gridCol w:w="4933"/>
+      </w:tblGrid>
+      <w:tr>
+        <w:tc>
+          <w:tcPr>
+            <w:tcW w:type="dxa" w:w="3453"/>
+            <w:shd w:val="clear" w:color="auto" w:fill="EEF2F6"/>
+          </w:tcPr>
+          <w:p>
+            <w:r>
+              <w:rPr>
+                <w:b/>
+                <w:sz w:val="18"/>
+              </w:rPr>
+              <w:t>Accesorios</w:t>
+            </w:r>
+          </w:p>
+        </w:tc>
+        <w:tc>
+          <w:tcPr>
+            <w:tcW w:type="dxa" w:w="6412"/>
+          </w:tcPr>
+          <w:p>
+            <w:r>
+              <w:rPr>
+                <w:sz w:val="18"/>
+              </w:rPr>
+              <w:t>No requeridos</w:t>
             </w:r>
           </w:p>
         </w:tc>
@@ -13986,6 +15704,68 @@
       </w:r>
     </w:p>
     <w:p>
+      <w:r>
+        <w:rPr>
+          <w:b/>
+          <w:color w:val="2F6FB0"/>
+        </w:rPr>
+        <w:t>[Información] Actuador: Factores de par estimados</w:t>
+      </w:r>
+    </w:p>
+    <w:p>
+      <w:r>
+        <w:t>El asiento metálico laminado de la triple excéntrica se cierra por par: se toma 1,5 veces el término B de la doble excéntrica. Confirmar el par de asentamiento con el fabricante.</w:t>
+      </w:r>
+    </w:p>
+    <w:p>
+      <w:r>
+        <w:rPr>
+          <w:i/>
+          <w:sz w:val="17"/>
+        </w:rPr>
+        <w:t>Referencia: Método de pares TB = A·ΔP + B y TD = C·ΔPef para válvulas rotativas, práctica de la industria</w:t>
+      </w:r>
+    </w:p>
+    <w:p>
+      <w:r>
+        <w:rPr>
+          <w:b/>
+          <w:color w:val="2F6FB0"/>
+        </w:rPr>
+        <w:t>[Información] Actuador: Aire máximo sobre el límite del actuador</w:t>
+      </w:r>
+    </w:p>
+    <w:p>
+      <w:r>
+        <w:t>El aire máximo (7,00 bar g (101,5 psig)) supera la presión máxima del actuador (3,45 bar g (50,0 psig)): el set de aire de la solapa 5 debe regularse por debajo de ese límite.</w:t>
+      </w:r>
+    </w:p>
+    <w:p>
+      <w:r>
+        <w:rPr>
+          <w:b/>
+        </w:rPr>
+        <w:t>Soluciones posibles:</w:t>
+      </w:r>
+    </w:p>
+    <w:p>
+      <w:pPr>
+        <w:pStyle w:val="ListBullet"/>
+      </w:pPr>
+      <w:r>
+        <w:t>Regular la alimentación entre 3,28 bar g (47,5 psig) y 3,45 bar g (50,0 psig) con el set de aire (solapa 5).</w:t>
+      </w:r>
+    </w:p>
+    <w:p>
+      <w:r>
+        <w:rPr>
+          <w:i/>
+          <w:sz w:val="17"/>
+        </w:rPr>
+        <w:t>Referencia: Práctica de la industria de válvulas de control (dimensionamiento de actuadores)</w:t>
+      </w:r>
+    </w:p>
+    <w:p>
       <w:pPr>
         <w:pStyle w:val="Heading2"/>
       </w:pPr>
@@ -15426,7 +17206,789 @@
         <w:pStyle w:val="Heading2"/>
       </w:pPr>
       <w:r>
-        <w:t>9. Recomendaciones finales</w:t>
+        <w:t>9. Actuador, posicionador y accesorios</w:t>
+      </w:r>
+    </w:p>
+    <w:p>
+      <w:r>
+        <w:t>Actuador apto: Diafragma y resorte D-069 con palanca de 50,8 mm (2,000 in): área 445 cm² (69,0 in²).</w:t>
+      </w:r>
+    </w:p>
+    <w:tbl>
+      <w:tblPr>
+        <w:tblStyle w:val="TableGrid"/>
+        <w:tblW w:type="auto" w:w="0"/>
+        <w:jc w:val="center"/>
+        <w:tblLayout w:type="fixed"/>
+        <w:tblLook w:firstColumn="1" w:firstRow="1" w:lastColumn="0" w:lastRow="0" w:noHBand="0" w:noVBand="1" w:val="04A0"/>
+      </w:tblPr>
+      <w:tblGrid>
+        <w:gridCol w:w="4933"/>
+        <w:gridCol w:w="4933"/>
+      </w:tblGrid>
+      <w:tr>
+        <w:tc>
+          <w:tcPr>
+            <w:tcW w:type="dxa" w:w="4439"/>
+            <w:shd w:val="clear" w:color="auto" w:fill="0D3B66"/>
+          </w:tcPr>
+          <w:p>
+            <w:r>
+              <w:rPr>
+                <w:b/>
+                <w:color w:val="FFFFFF"/>
+                <w:sz w:val="18"/>
+              </w:rPr>
+              <w:t>Componente</w:t>
+            </w:r>
+          </w:p>
+        </w:tc>
+        <w:tc>
+          <w:tcPr>
+            <w:tcW w:type="dxa" w:w="5426"/>
+            <w:shd w:val="clear" w:color="auto" w:fill="0D3B66"/>
+          </w:tcPr>
+          <w:p>
+            <w:r>
+              <w:rPr>
+                <w:b/>
+                <w:color w:val="FFFFFF"/>
+                <w:sz w:val="18"/>
+              </w:rPr>
+              <w:t>Valor</w:t>
+            </w:r>
+          </w:p>
+        </w:tc>
+      </w:tr>
+      <w:tr>
+        <w:tc>
+          <w:tcPr>
+            <w:tcW w:type="dxa" w:w="4439"/>
+          </w:tcPr>
+          <w:p>
+            <w:r>
+              <w:rPr>
+                <w:sz w:val="18"/>
+              </w:rPr>
+              <w:t>A (factor de presión)</w:t>
+            </w:r>
+          </w:p>
+        </w:tc>
+        <w:tc>
+          <w:tcPr>
+            <w:tcW w:type="dxa" w:w="5426"/>
+          </w:tcPr>
+          <w:p>
+            <w:r>
+              <w:rPr>
+                <w:sz w:val="18"/>
+              </w:rPr>
+              <w:t>4,200 lbf·in/psi</w:t>
+            </w:r>
+          </w:p>
+        </w:tc>
+      </w:tr>
+      <w:tr>
+        <w:tc>
+          <w:tcPr>
+            <w:tcW w:type="dxa" w:w="4439"/>
+          </w:tcPr>
+          <w:p>
+            <w:r>
+              <w:rPr>
+                <w:sz w:val="18"/>
+              </w:rPr>
+              <w:t>B (fricción de asientos, cojinetes y empaquetadura)</w:t>
+            </w:r>
+          </w:p>
+        </w:tc>
+        <w:tc>
+          <w:tcPr>
+            <w:tcW w:type="dxa" w:w="5426"/>
+          </w:tcPr>
+          <w:p>
+            <w:r>
+              <w:rPr>
+                <w:sz w:val="18"/>
+              </w:rPr>
+              <w:t>113 N·m (998 lbf·in)</w:t>
+            </w:r>
+          </w:p>
+        </w:tc>
+      </w:tr>
+      <w:tr>
+        <w:tc>
+          <w:tcPr>
+            <w:tcW w:type="dxa" w:w="4439"/>
+          </w:tcPr>
+          <w:p>
+            <w:r>
+              <w:rPr>
+                <w:sz w:val="18"/>
+              </w:rPr>
+              <w:t>TB, par de arranque</w:t>
+            </w:r>
+          </w:p>
+        </w:tc>
+        <w:tc>
+          <w:tcPr>
+            <w:tcW w:type="dxa" w:w="5426"/>
+          </w:tcPr>
+          <w:p>
+            <w:r>
+              <w:rPr>
+                <w:sz w:val="18"/>
+              </w:rPr>
+              <w:t>160 N·m (1.412 lbf·in)</w:t>
+            </w:r>
+          </w:p>
+        </w:tc>
+      </w:tr>
+      <w:tr>
+        <w:tc>
+          <w:tcPr>
+            <w:tcW w:type="dxa" w:w="4439"/>
+          </w:tcPr>
+          <w:p>
+            <w:r>
+              <w:rPr>
+                <w:sz w:val="18"/>
+              </w:rPr>
+              <w:t>TD, par dinámico máximo</w:t>
+            </w:r>
+          </w:p>
+        </w:tc>
+        <w:tc>
+          <w:tcPr>
+            <w:tcW w:type="dxa" w:w="5426"/>
+          </w:tcPr>
+          <w:p>
+            <w:r>
+              <w:rPr>
+                <w:sz w:val="18"/>
+              </w:rPr>
+              <w:t>85 N·m (748 lbf·in)</w:t>
+            </w:r>
+          </w:p>
+        </w:tc>
+      </w:tr>
+      <w:tr>
+        <w:tc>
+          <w:tcPr>
+            <w:tcW w:type="dxa" w:w="4439"/>
+          </w:tcPr>
+          <w:p>
+            <w:r>
+              <w:rPr>
+                <w:sz w:val="18"/>
+              </w:rPr>
+              <w:t>Par requerido con margen 1,25</w:t>
+            </w:r>
+          </w:p>
+        </w:tc>
+        <w:tc>
+          <w:tcPr>
+            <w:tcW w:type="dxa" w:w="5426"/>
+          </w:tcPr>
+          <w:p>
+            <w:r>
+              <w:rPr>
+                <w:sz w:val="18"/>
+              </w:rPr>
+              <w:t>199 N·m (1.765 lbf·in)</w:t>
+            </w:r>
+          </w:p>
+        </w:tc>
+      </w:tr>
+    </w:tbl>
+    <w:p/>
+    <w:tbl>
+      <w:tblPr>
+        <w:tblStyle w:val="TableGrid"/>
+        <w:tblW w:type="auto" w:w="0"/>
+        <w:jc w:val="center"/>
+        <w:tblLayout w:type="fixed"/>
+        <w:tblLook w:firstColumn="1" w:firstRow="1" w:lastColumn="0" w:lastRow="0" w:noHBand="0" w:noVBand="1" w:val="04A0"/>
+      </w:tblPr>
+      <w:tblGrid>
+        <w:gridCol w:w="4933"/>
+        <w:gridCol w:w="4933"/>
+      </w:tblGrid>
+      <w:tr>
+        <w:tc>
+          <w:tcPr>
+            <w:tcW w:type="dxa" w:w="3453"/>
+            <w:shd w:val="clear" w:color="auto" w:fill="EEF2F6"/>
+          </w:tcPr>
+          <w:p>
+            <w:r>
+              <w:rPr>
+                <w:b/>
+                <w:sz w:val="18"/>
+              </w:rPr>
+              <w:t>Tipo de actuador</w:t>
+            </w:r>
+          </w:p>
+        </w:tc>
+        <w:tc>
+          <w:tcPr>
+            <w:tcW w:type="dxa" w:w="6412"/>
+          </w:tcPr>
+          <w:p>
+            <w:r>
+              <w:rPr>
+                <w:sz w:val="18"/>
+              </w:rPr>
+              <w:t>Diafragma y resorte</w:t>
+            </w:r>
+          </w:p>
+        </w:tc>
+      </w:tr>
+      <w:tr>
+        <w:tc>
+          <w:tcPr>
+            <w:tcW w:type="dxa" w:w="3453"/>
+            <w:shd w:val="clear" w:color="auto" w:fill="EEF2F6"/>
+          </w:tcPr>
+          <w:p>
+            <w:r>
+              <w:rPr>
+                <w:b/>
+                <w:sz w:val="18"/>
+              </w:rPr>
+              <w:t>Modo de falla</w:t>
+            </w:r>
+          </w:p>
+        </w:tc>
+        <w:tc>
+          <w:tcPr>
+            <w:tcW w:type="dxa" w:w="6412"/>
+          </w:tcPr>
+          <w:p>
+            <w:r>
+              <w:rPr>
+                <w:sz w:val="18"/>
+              </w:rPr>
+              <w:t>Cierra (FC)</w:t>
+            </w:r>
+          </w:p>
+        </w:tc>
+      </w:tr>
+      <w:tr>
+        <w:tc>
+          <w:tcPr>
+            <w:tcW w:type="dxa" w:w="3453"/>
+            <w:shd w:val="clear" w:color="auto" w:fill="EEF2F6"/>
+          </w:tcPr>
+          <w:p>
+            <w:r>
+              <w:rPr>
+                <w:b/>
+                <w:sz w:val="18"/>
+              </w:rPr>
+              <w:t>Volante (mando manual)</w:t>
+            </w:r>
+          </w:p>
+        </w:tc>
+        <w:tc>
+          <w:tcPr>
+            <w:tcW w:type="dxa" w:w="6412"/>
+          </w:tcPr>
+          <w:p>
+            <w:r>
+              <w:rPr>
+                <w:sz w:val="18"/>
+              </w:rPr>
+              <w:t>No</w:t>
+            </w:r>
+          </w:p>
+        </w:tc>
+      </w:tr>
+      <w:tr>
+        <w:tc>
+          <w:tcPr>
+            <w:tcW w:type="dxa" w:w="3453"/>
+            <w:shd w:val="clear" w:color="auto" w:fill="EEF2F6"/>
+          </w:tcPr>
+          <w:p>
+            <w:r>
+              <w:rPr>
+                <w:b/>
+                <w:sz w:val="18"/>
+              </w:rPr>
+              <w:t>Aire de instrumentos disponible</w:t>
+            </w:r>
+          </w:p>
+        </w:tc>
+        <w:tc>
+          <w:tcPr>
+            <w:tcW w:type="dxa" w:w="6412"/>
+          </w:tcPr>
+          <w:p>
+            <w:r>
+              <w:rPr>
+                <w:sz w:val="18"/>
+              </w:rPr>
+              <w:t>4,00 a 7,00 bar g (mínimo a máximo)</w:t>
+            </w:r>
+          </w:p>
+        </w:tc>
+      </w:tr>
+      <w:tr>
+        <w:tc>
+          <w:tcPr>
+            <w:tcW w:type="dxa" w:w="3453"/>
+            <w:shd w:val="clear" w:color="auto" w:fill="EEF2F6"/>
+          </w:tcPr>
+          <w:p>
+            <w:r>
+              <w:rPr>
+                <w:b/>
+                <w:sz w:val="18"/>
+              </w:rPr>
+              <w:t>Selección</w:t>
+            </w:r>
+          </w:p>
+        </w:tc>
+        <w:tc>
+          <w:tcPr>
+            <w:tcW w:type="dxa" w:w="6412"/>
+          </w:tcPr>
+          <w:p>
+            <w:r>
+              <w:rPr>
+                <w:sz w:val="18"/>
+              </w:rPr>
+              <w:t>Diafragma y resorte D-069 con palanca de 50,8 mm (2,000 in): área 445 cm² (69,0 in²)</w:t>
+            </w:r>
+          </w:p>
+        </w:tc>
+      </w:tr>
+      <w:tr>
+        <w:tc>
+          <w:tcPr>
+            <w:tcW w:type="dxa" w:w="3453"/>
+            <w:shd w:val="clear" w:color="auto" w:fill="EEF2F6"/>
+          </w:tcPr>
+          <w:p>
+            <w:r>
+              <w:rPr>
+                <w:b/>
+                <w:sz w:val="18"/>
+              </w:rPr>
+              <w:t>Método</w:t>
+            </w:r>
+          </w:p>
+        </w:tc>
+        <w:tc>
+          <w:tcPr>
+            <w:tcW w:type="dxa" w:w="6412"/>
+          </w:tcPr>
+          <w:p>
+            <w:r>
+              <w:rPr>
+                <w:sz w:val="18"/>
+              </w:rPr>
+              <w:t>Pares de arranque y dinámico de válvula rotativa</w:t>
+            </w:r>
+          </w:p>
+        </w:tc>
+      </w:tr>
+      <w:tr>
+        <w:tc>
+          <w:tcPr>
+            <w:tcW w:type="dxa" w:w="3453"/>
+            <w:shd w:val="clear" w:color="auto" w:fill="EEF2F6"/>
+          </w:tcPr>
+          <w:p>
+            <w:r>
+              <w:rPr>
+                <w:b/>
+                <w:sz w:val="18"/>
+              </w:rPr>
+              <w:t>Ajuste de banco (bench set)</w:t>
+            </w:r>
+          </w:p>
+        </w:tc>
+        <w:tc>
+          <w:tcPr>
+            <w:tcW w:type="dxa" w:w="6412"/>
+          </w:tcPr>
+          <w:p>
+            <w:r>
+              <w:rPr>
+                <w:sz w:val="18"/>
+              </w:rPr>
+              <w:t>15,5 – 32,5 psig (1,07 – 2,24 bar g)</w:t>
+            </w:r>
+          </w:p>
+        </w:tc>
+      </w:tr>
+      <w:tr>
+        <w:tc>
+          <w:tcPr>
+            <w:tcW w:type="dxa" w:w="3453"/>
+            <w:shd w:val="clear" w:color="auto" w:fill="EEF2F6"/>
+          </w:tcPr>
+          <w:p>
+            <w:r>
+              <w:rPr>
+                <w:b/>
+                <w:sz w:val="18"/>
+              </w:rPr>
+              <w:t>Constante del resorte</w:t>
+            </w:r>
+          </w:p>
+        </w:tc>
+        <w:tc>
+          <w:tcPr>
+            <w:tcW w:type="dxa" w:w="6412"/>
+          </w:tcPr>
+          <w:p>
+            <w:r>
+              <w:rPr>
+                <w:sz w:val="18"/>
+              </w:rPr>
+              <w:t>72,6 N/mm (415 lbf/in)</w:t>
+            </w:r>
+          </w:p>
+        </w:tc>
+      </w:tr>
+      <w:tr>
+        <w:tc>
+          <w:tcPr>
+            <w:tcW w:type="dxa" w:w="3453"/>
+            <w:shd w:val="clear" w:color="auto" w:fill="EEF2F6"/>
+          </w:tcPr>
+          <w:p>
+            <w:r>
+              <w:rPr>
+                <w:b/>
+                <w:sz w:val="18"/>
+              </w:rPr>
+              <w:t>Par de falla del resorte en el asiento</w:t>
+            </w:r>
+          </w:p>
+        </w:tc>
+        <w:tc>
+          <w:tcPr>
+            <w:tcW w:type="dxa" w:w="6412"/>
+          </w:tcPr>
+          <w:p>
+            <w:r>
+              <w:rPr>
+                <w:sz w:val="18"/>
+              </w:rPr>
+              <w:t>205 N·m (1.818 lbf·in)</w:t>
+            </w:r>
+          </w:p>
+        </w:tc>
+      </w:tr>
+      <w:tr>
+        <w:tc>
+          <w:tcPr>
+            <w:tcW w:type="dxa" w:w="3453"/>
+            <w:shd w:val="clear" w:color="auto" w:fill="EEF2F6"/>
+          </w:tcPr>
+          <w:p>
+            <w:r>
+              <w:rPr>
+                <w:b/>
+                <w:sz w:val="18"/>
+              </w:rPr>
+              <w:t>Presión de aire requerida</w:t>
+            </w:r>
+          </w:p>
+        </w:tc>
+        <w:tc>
+          <w:tcPr>
+            <w:tcW w:type="dxa" w:w="6412"/>
+          </w:tcPr>
+          <w:p>
+            <w:r>
+              <w:rPr>
+                <w:sz w:val="18"/>
+              </w:rPr>
+              <w:t>3,28 bar g (47,5 psig)</w:t>
+            </w:r>
+          </w:p>
+        </w:tc>
+      </w:tr>
+    </w:tbl>
+    <w:p/>
+    <w:p>
+      <w:pPr>
+        <w:pStyle w:val="Heading3"/>
+      </w:pPr>
+      <w:r>
+        <w:t>Posicionador</w:t>
+      </w:r>
+    </w:p>
+    <w:tbl>
+      <w:tblPr>
+        <w:tblStyle w:val="TableGrid"/>
+        <w:tblW w:type="auto" w:w="0"/>
+        <w:jc w:val="center"/>
+        <w:tblLayout w:type="fixed"/>
+        <w:tblLook w:firstColumn="1" w:firstRow="1" w:lastColumn="0" w:lastRow="0" w:noHBand="0" w:noVBand="1" w:val="04A0"/>
+      </w:tblPr>
+      <w:tblGrid>
+        <w:gridCol w:w="4933"/>
+        <w:gridCol w:w="4933"/>
+      </w:tblGrid>
+      <w:tr>
+        <w:tc>
+          <w:tcPr>
+            <w:tcW w:type="dxa" w:w="3453"/>
+            <w:shd w:val="clear" w:color="auto" w:fill="EEF2F6"/>
+          </w:tcPr>
+          <w:p>
+            <w:r>
+              <w:rPr>
+                <w:b/>
+                <w:sz w:val="18"/>
+              </w:rPr>
+              <w:t>Tag</w:t>
+            </w:r>
+          </w:p>
+        </w:tc>
+        <w:tc>
+          <w:tcPr>
+            <w:tcW w:type="dxa" w:w="6412"/>
+          </w:tcPr>
+          <w:p>
+            <w:r>
+              <w:rPr>
+                <w:sz w:val="18"/>
+              </w:rPr>
+              <w:t>—</w:t>
+            </w:r>
+          </w:p>
+        </w:tc>
+      </w:tr>
+      <w:tr>
+        <w:tc>
+          <w:tcPr>
+            <w:tcW w:type="dxa" w:w="3453"/>
+            <w:shd w:val="clear" w:color="auto" w:fill="EEF2F6"/>
+          </w:tcPr>
+          <w:p>
+            <w:r>
+              <w:rPr>
+                <w:b/>
+                <w:sz w:val="18"/>
+              </w:rPr>
+              <w:t>Tipo</w:t>
+            </w:r>
+          </w:p>
+        </w:tc>
+        <w:tc>
+          <w:tcPr>
+            <w:tcW w:type="dxa" w:w="6412"/>
+          </w:tcPr>
+          <w:p>
+            <w:r>
+              <w:rPr>
+                <w:sz w:val="18"/>
+              </w:rPr>
+              <w:t>Digital-HART</w:t>
+            </w:r>
+          </w:p>
+        </w:tc>
+      </w:tr>
+      <w:tr>
+        <w:tc>
+          <w:tcPr>
+            <w:tcW w:type="dxa" w:w="3453"/>
+            <w:shd w:val="clear" w:color="auto" w:fill="EEF2F6"/>
+          </w:tcPr>
+          <w:p>
+            <w:r>
+              <w:rPr>
+                <w:b/>
+                <w:sz w:val="18"/>
+              </w:rPr>
+              <w:t>Señal de entrada</w:t>
+            </w:r>
+          </w:p>
+        </w:tc>
+        <w:tc>
+          <w:tcPr>
+            <w:tcW w:type="dxa" w:w="6412"/>
+          </w:tcPr>
+          <w:p>
+            <w:r>
+              <w:rPr>
+                <w:sz w:val="18"/>
+              </w:rPr>
+              <w:t>4-20mA dc</w:t>
+            </w:r>
+          </w:p>
+        </w:tc>
+      </w:tr>
+      <w:tr>
+        <w:tc>
+          <w:tcPr>
+            <w:tcW w:type="dxa" w:w="3453"/>
+            <w:shd w:val="clear" w:color="auto" w:fill="EEF2F6"/>
+          </w:tcPr>
+          <w:p>
+            <w:r>
+              <w:rPr>
+                <w:b/>
+                <w:sz w:val="18"/>
+              </w:rPr>
+              <w:t>Acción</w:t>
+            </w:r>
+          </w:p>
+        </w:tc>
+        <w:tc>
+          <w:tcPr>
+            <w:tcW w:type="dxa" w:w="6412"/>
+          </w:tcPr>
+          <w:p>
+            <w:r>
+              <w:rPr>
+                <w:sz w:val="18"/>
+              </w:rPr>
+              <w:t>Configurable</w:t>
+            </w:r>
+          </w:p>
+        </w:tc>
+      </w:tr>
+      <w:tr>
+        <w:tc>
+          <w:tcPr>
+            <w:tcW w:type="dxa" w:w="3453"/>
+            <w:shd w:val="clear" w:color="auto" w:fill="EEF2F6"/>
+          </w:tcPr>
+          <w:p>
+            <w:r>
+              <w:rPr>
+                <w:b/>
+                <w:sz w:val="18"/>
+              </w:rPr>
+              <w:t>Manómetros</w:t>
+            </w:r>
+          </w:p>
+        </w:tc>
+        <w:tc>
+          <w:tcPr>
+            <w:tcW w:type="dxa" w:w="6412"/>
+          </w:tcPr>
+          <w:p>
+            <w:r>
+              <w:rPr>
+                <w:sz w:val="18"/>
+              </w:rPr>
+              <w:t>Sí</w:t>
+            </w:r>
+          </w:p>
+        </w:tc>
+      </w:tr>
+      <w:tr>
+        <w:tc>
+          <w:tcPr>
+            <w:tcW w:type="dxa" w:w="3453"/>
+            <w:shd w:val="clear" w:color="auto" w:fill="EEF2F6"/>
+          </w:tcPr>
+          <w:p>
+            <w:r>
+              <w:rPr>
+                <w:b/>
+                <w:sz w:val="18"/>
+              </w:rPr>
+              <w:t>Set de aire de instrumentos</w:t>
+            </w:r>
+          </w:p>
+        </w:tc>
+        <w:tc>
+          <w:tcPr>
+            <w:tcW w:type="dxa" w:w="6412"/>
+          </w:tcPr>
+          <w:p>
+            <w:r>
+              <w:rPr>
+                <w:sz w:val="18"/>
+              </w:rPr>
+              <w:t>Sí</w:t>
+            </w:r>
+          </w:p>
+        </w:tc>
+      </w:tr>
+      <w:tr>
+        <w:tc>
+          <w:tcPr>
+            <w:tcW w:type="dxa" w:w="3453"/>
+            <w:shd w:val="clear" w:color="auto" w:fill="EEF2F6"/>
+          </w:tcPr>
+          <w:p>
+            <w:r>
+              <w:rPr>
+                <w:b/>
+                <w:sz w:val="18"/>
+              </w:rPr>
+              <w:t>Salida del set de aire</w:t>
+            </w:r>
+          </w:p>
+        </w:tc>
+        <w:tc>
+          <w:tcPr>
+            <w:tcW w:type="dxa" w:w="6412"/>
+          </w:tcPr>
+          <w:p>
+            <w:r>
+              <w:rPr>
+                <w:sz w:val="18"/>
+              </w:rPr>
+              <w:t>Ajustable 0-80 psi</w:t>
+            </w:r>
+          </w:p>
+        </w:tc>
+      </w:tr>
+      <w:tr>
+        <w:tc>
+          <w:tcPr>
+            <w:tcW w:type="dxa" w:w="3453"/>
+            <w:shd w:val="clear" w:color="auto" w:fill="EEF2F6"/>
+          </w:tcPr>
+          <w:p>
+            <w:r>
+              <w:rPr>
+                <w:b/>
+                <w:sz w:val="18"/>
+              </w:rPr>
+              <w:t>Señales habilitadas</w:t>
+            </w:r>
+          </w:p>
+        </w:tc>
+        <w:tc>
+          <w:tcPr>
+            <w:tcW w:type="dxa" w:w="6412"/>
+          </w:tcPr>
+          <w:p>
+            <w:r>
+              <w:rPr>
+                <w:sz w:val="18"/>
+              </w:rPr>
+              <w:t>4-20mA dc, 4-12mA dc, 12-20mA dc</w:t>
+            </w:r>
+          </w:p>
+        </w:tc>
+      </w:tr>
+    </w:tbl>
+    <w:p/>
+    <w:p>
+      <w:r>
+        <w:t>Acción sugerida: Configurable. Set de aire sugerido: Ajustable 0-80 psi.</w:t>
+      </w:r>
+    </w:p>
+    <w:p>
+      <w:pPr>
+        <w:pStyle w:val="Heading2"/>
+      </w:pPr>
+      <w:r>
+        <w:t>10. Recomendaciones finales</w:t>
       </w:r>
     </w:p>
     <w:p>
@@ -15455,10 +18017,18 @@
     </w:p>
     <w:p>
       <w:pPr>
+        <w:pStyle w:val="ListBullet"/>
+      </w:pPr>
+      <w:r>
+        <w:t>Confirmar con el fabricante del actuador el modelo, el resorte y el ajuste de banco: el programa dimensiona con series genéricas y factores típicos de la industria.</w:t>
+      </w:r>
+    </w:p>
+    <w:p>
+      <w:pPr>
         <w:pStyle w:val="Heading2"/>
       </w:pPr>
       <w:r>
-        <w:t>10. Alcance y referencias</w:t>
+        <w:t>11. Alcance y referencias</w:t>
       </w:r>
     </w:p>
     <w:p>
@@ -15514,7 +18084,15 @@
         <w:pStyle w:val="ListBullet"/>
       </w:pPr>
       <w:r>
-        <w:t>Calculado con N25 Valves Sizing 0.8.2 de INSTRUMATIK S.A.S.. Software independiente de fabricantes.</w:t>
+        <w:t>Actuador: método de fuerzas A + B + C + D (vástago deslizante) y método de pares TB = A·ΔP + B, TD = C·ΔPef (rotativas), práctica de la industria de válvulas de control.</w:t>
+      </w:r>
+    </w:p>
+    <w:p>
+      <w:pPr>
+        <w:pStyle w:val="ListBullet"/>
+      </w:pPr>
+      <w:r>
+        <w:t>Calculado con N25 Valves Sizing 0.9.0 de INSTRUMATIK S.A.S.. Software independiente de fabricantes.</w:t>
       </w:r>
     </w:p>
     <w:sectPr>
@@ -15540,7 +18118,7 @@
       <w:rPr>
         <w:sz w:val="16"/>
       </w:rPr>
-      <w:t xml:space="preserve">N25 Valves Sizing 0.8.2 · Página </w:t>
+      <w:t xml:space="preserve">N25 Valves Sizing 0.9.0 · Página </w:t>
     </w:r>
     <w:r>
       <w:fldChar w:fldCharType="begin"/>

</xml_diff>

<commit_message>
v0.9.1: concordancia entre tipo de válvula, actuador y sentido de flujo
Bloquea en 4-Actuador los actuadores rotativos en válvulas de vástago deslizante
y los lineales en rotativas; Flow agrega Unidireccional y Bidireccional (solo
bolas flotante y trunnion), con Up/Down solo para globo y ángulo.

Co-Authored-By: Claude Opus 5.5 (1M context) <noreply@anthropic.com>
Claude-Session: https://claude.ai/code/session_01U4yJ7uLSXttFganqs6AWmH
</commit_message>
<xml_diff>
--- a/kit_workshop/resultados_de_referencia/Caso_A_baja_agua_enfriamiento_mariposa_resultados_N25.docx
+++ b/kit_workshop/resultados_de_referencia/Caso_A_baja_agua_enfriamiento_mariposa_resultados_N25.docx
@@ -7310,7 +7310,7 @@
               <w:rPr>
                 <w:sz w:val="18"/>
               </w:rPr>
-              <w:t>Diafragma y resorte</w:t>
+              <w:t>Piñón y cremallera (Rack and pinion)</w:t>
             </w:r>
           </w:p>
         </w:tc>
@@ -7422,7 +7422,7 @@
               <w:rPr>
                 <w:sz w:val="18"/>
               </w:rPr>
-              <w:t>Diafragma y resorte D-069 con palanca de 50,8 mm (2,000 in): área 445 cm² (69,0 in²)</w:t>
+              <w:t>Piñón y cremallera R-08 con retorno por resorte: 599 N·m (5.300 lbf·in) a 5,5 bar</w:t>
             </w:r>
           </w:p>
         </w:tc>
@@ -7465,7 +7465,7 @@
               <w:rPr>
                 <w:sz w:val="18"/>
               </w:rPr>
-              <w:t>Ajuste de banco (bench set)</w:t>
+              <w:t>Flow (sentido del flujo)</w:t>
             </w:r>
           </w:p>
         </w:tc>
@@ -7478,7 +7478,7 @@
               <w:rPr>
                 <w:sz w:val="18"/>
               </w:rPr>
-              <w:t>15,5 – 32,5 psig (1,07 – 2,24 bar g)</w:t>
+              <w:t>Unidireccional: cierra con presión en el sentido marcado en el cuerpo</w:t>
             </w:r>
           </w:p>
         </w:tc>
@@ -7493,7 +7493,7 @@
               <w:rPr>
                 <w:sz w:val="18"/>
               </w:rPr>
-              <w:t>Constante del resorte</w:t>
+              <w:t>Par de aire con aire mínimo</w:t>
             </w:r>
           </w:p>
         </w:tc>
@@ -7506,7 +7506,7 @@
               <w:rPr>
                 <w:sz w:val="18"/>
               </w:rPr>
-              <w:t>72,6 N/mm (415 lbf/in)</w:t>
+              <w:t>434 N·m (3.844 lbf·in)</w:t>
             </w:r>
           </w:p>
         </w:tc>
@@ -7521,7 +7521,7 @@
               <w:rPr>
                 <w:sz w:val="18"/>
               </w:rPr>
-              <w:t>Par de falla del resorte en el asiento</w:t>
+              <w:t>Par del resorte al final (posición de falla)</w:t>
             </w:r>
           </w:p>
         </w:tc>
@@ -7534,7 +7534,7 @@
               <w:rPr>
                 <w:sz w:val="18"/>
               </w:rPr>
-              <w:t>205 N·m (1.818 lbf·in)</w:t>
+              <w:t>199 N·m (1.765 lbf·in)</w:t>
             </w:r>
           </w:p>
         </w:tc>
@@ -7549,6 +7549,62 @@
               <w:rPr>
                 <w:sz w:val="18"/>
               </w:rPr>
+              <w:t>Par del resorte al comienzo</w:t>
+            </w:r>
+          </w:p>
+        </w:tc>
+        <w:tc>
+          <w:tcPr>
+            <w:tcW w:type="dxa" w:w="6412"/>
+          </w:tcPr>
+          <w:p>
+            <w:r>
+              <w:rPr>
+                <w:sz w:val="18"/>
+              </w:rPr>
+              <w:t>289 N·m (2.559 lbf·in)</w:t>
+            </w:r>
+          </w:p>
+        </w:tc>
+      </w:tr>
+      <w:tr>
+        <w:tc>
+          <w:tcPr>
+            <w:tcW w:type="dxa" w:w="3453"/>
+          </w:tcPr>
+          <w:p>
+            <w:r>
+              <w:rPr>
+                <w:sz w:val="18"/>
+              </w:rPr>
+              <w:t>Par de aire al comienzo / al final</w:t>
+            </w:r>
+          </w:p>
+        </w:tc>
+        <w:tc>
+          <w:tcPr>
+            <w:tcW w:type="dxa" w:w="6412"/>
+          </w:tcPr>
+          <w:p>
+            <w:r>
+              <w:rPr>
+                <w:sz w:val="18"/>
+              </w:rPr>
+              <w:t>235 N·m (2.079 lbf·in) / 145 N·m (1.285 lbf·in)</w:t>
+            </w:r>
+          </w:p>
+        </w:tc>
+      </w:tr>
+      <w:tr>
+        <w:tc>
+          <w:tcPr>
+            <w:tcW w:type="dxa" w:w="3453"/>
+          </w:tcPr>
+          <w:p>
+            <w:r>
+              <w:rPr>
+                <w:sz w:val="18"/>
+              </w:rPr>
               <w:t>Presión de aire requerida</w:t>
             </w:r>
           </w:p>
@@ -7562,7 +7618,7 @@
               <w:rPr>
                 <w:sz w:val="18"/>
               </w:rPr>
-              <w:t>3,28 bar g (47,5 psig)</w:t>
+              <w:t>3,67 bar g (53,3 psig)</w:t>
             </w:r>
           </w:p>
         </w:tc>
@@ -11218,7 +11274,7 @@
               <w:rPr>
                 <w:sz w:val="18"/>
               </w:rPr>
-              <w:t>Diafragma y resorte</w:t>
+              <w:t>Piñón y cremallera (Rack and pinion)</w:t>
             </w:r>
           </w:p>
         </w:tc>
@@ -11338,7 +11394,7 @@
               <w:rPr>
                 <w:sz w:val="18"/>
               </w:rPr>
-              <w:t>Diafragma y resorte D-069 con palanca de 50,8 mm (2,000 in): área 445 cm² (69,0 in²)</w:t>
+              <w:t>Piñón y cremallera R-08 con retorno por resorte: 599 N·m (5.300 lbf·in) a 5,5 bar</w:t>
             </w:r>
           </w:p>
         </w:tc>
@@ -11415,7 +11471,7 @@
                 <w:b/>
                 <w:sz w:val="18"/>
               </w:rPr>
-              <w:t>Ajuste de banco (bench set)</w:t>
+              <w:t>Flow (sentido del flujo)</w:t>
             </w:r>
           </w:p>
         </w:tc>
@@ -11428,7 +11484,7 @@
               <w:rPr>
                 <w:sz w:val="18"/>
               </w:rPr>
-              <w:t>15,5 – 32,5 psig (1,07 – 2,24 bar g)</w:t>
+              <w:t>Unidireccional: cierra con presión en el sentido marcado en el cuerpo</w:t>
             </w:r>
           </w:p>
         </w:tc>
@@ -11445,7 +11501,7 @@
                 <w:b/>
                 <w:sz w:val="18"/>
               </w:rPr>
-              <w:t>Constante del resorte</w:t>
+              <w:t>Par de aire con aire mínimo</w:t>
             </w:r>
           </w:p>
         </w:tc>
@@ -11458,7 +11514,7 @@
               <w:rPr>
                 <w:sz w:val="18"/>
               </w:rPr>
-              <w:t>72,6 N/mm (415 lbf/in)</w:t>
+              <w:t>434 N·m (3.844 lbf·in)</w:t>
             </w:r>
           </w:p>
         </w:tc>
@@ -11475,7 +11531,7 @@
                 <w:b/>
                 <w:sz w:val="18"/>
               </w:rPr>
-              <w:t>Par de falla del resorte en el asiento</w:t>
+              <w:t>Par del resorte al final (posición de falla)</w:t>
             </w:r>
           </w:p>
         </w:tc>
@@ -11488,7 +11544,7 @@
               <w:rPr>
                 <w:sz w:val="18"/>
               </w:rPr>
-              <w:t>205 N·m (1.818 lbf·in)</w:t>
+              <w:t>199 N·m (1.765 lbf·in)</w:t>
             </w:r>
           </w:p>
         </w:tc>
@@ -11505,6 +11561,66 @@
                 <w:b/>
                 <w:sz w:val="18"/>
               </w:rPr>
+              <w:t>Par del resorte al comienzo</w:t>
+            </w:r>
+          </w:p>
+        </w:tc>
+        <w:tc>
+          <w:tcPr>
+            <w:tcW w:type="dxa" w:w="6412"/>
+          </w:tcPr>
+          <w:p>
+            <w:r>
+              <w:rPr>
+                <w:sz w:val="18"/>
+              </w:rPr>
+              <w:t>289 N·m (2.559 lbf·in)</w:t>
+            </w:r>
+          </w:p>
+        </w:tc>
+      </w:tr>
+      <w:tr>
+        <w:tc>
+          <w:tcPr>
+            <w:tcW w:type="dxa" w:w="3453"/>
+            <w:shd w:val="clear" w:color="auto" w:fill="EEF2F6"/>
+          </w:tcPr>
+          <w:p>
+            <w:r>
+              <w:rPr>
+                <w:b/>
+                <w:sz w:val="18"/>
+              </w:rPr>
+              <w:t>Par de aire al comienzo / al final</w:t>
+            </w:r>
+          </w:p>
+        </w:tc>
+        <w:tc>
+          <w:tcPr>
+            <w:tcW w:type="dxa" w:w="6412"/>
+          </w:tcPr>
+          <w:p>
+            <w:r>
+              <w:rPr>
+                <w:sz w:val="18"/>
+              </w:rPr>
+              <w:t>235 N·m (2.079 lbf·in) / 145 N·m (1.285 lbf·in)</w:t>
+            </w:r>
+          </w:p>
+        </w:tc>
+      </w:tr>
+      <w:tr>
+        <w:tc>
+          <w:tcPr>
+            <w:tcW w:type="dxa" w:w="3453"/>
+            <w:shd w:val="clear" w:color="auto" w:fill="EEF2F6"/>
+          </w:tcPr>
+          <w:p>
+            <w:r>
+              <w:rPr>
+                <w:b/>
+                <w:sz w:val="18"/>
+              </w:rPr>
               <w:t>Presión de aire requerida</w:t>
             </w:r>
           </w:p>
@@ -11518,7 +11634,7 @@
               <w:rPr>
                 <w:sz w:val="18"/>
               </w:rPr>
-              <w:t>3,28 bar g (47,5 psig)</w:t>
+              <w:t>3,67 bar g (53,3 psig)</w:t>
             </w:r>
           </w:p>
         </w:tc>
@@ -15727,45 +15843,6 @@
       </w:r>
     </w:p>
     <w:p>
-      <w:r>
-        <w:rPr>
-          <w:b/>
-          <w:color w:val="2F6FB0"/>
-        </w:rPr>
-        <w:t>[Información] Actuador: Aire máximo sobre el límite del actuador</w:t>
-      </w:r>
-    </w:p>
-    <w:p>
-      <w:r>
-        <w:t>El aire máximo (7,00 bar g (101,5 psig)) supera la presión máxima del actuador (3,45 bar g (50,0 psig)): el set de aire de la solapa 5 debe regularse por debajo de ese límite.</w:t>
-      </w:r>
-    </w:p>
-    <w:p>
-      <w:r>
-        <w:rPr>
-          <w:b/>
-        </w:rPr>
-        <w:t>Soluciones posibles:</w:t>
-      </w:r>
-    </w:p>
-    <w:p>
-      <w:pPr>
-        <w:pStyle w:val="ListBullet"/>
-      </w:pPr>
-      <w:r>
-        <w:t>Regular la alimentación entre 3,28 bar g (47,5 psig) y 3,45 bar g (50,0 psig) con el set de aire (solapa 5).</w:t>
-      </w:r>
-    </w:p>
-    <w:p>
-      <w:r>
-        <w:rPr>
-          <w:i/>
-          <w:sz w:val="17"/>
-        </w:rPr>
-        <w:t>Referencia: Práctica de la industria de válvulas de control (dimensionamiento de actuadores)</w:t>
-      </w:r>
-    </w:p>
-    <w:p>
       <w:pPr>
         <w:pStyle w:val="Heading2"/>
       </w:pPr>
@@ -17211,7 +17288,7 @@
     </w:p>
     <w:p>
       <w:r>
-        <w:t>Actuador apto: Diafragma y resorte D-069 con palanca de 50,8 mm (2,000 in): área 445 cm² (69,0 in²).</w:t>
+        <w:t>Actuador apto: Piñón y cremallera R-08 con retorno por resorte: 599 N·m (5.300 lbf·in) a 5,5 bar.</w:t>
       </w:r>
     </w:p>
     <w:tbl>
@@ -17439,7 +17516,7 @@
               <w:rPr>
                 <w:sz w:val="18"/>
               </w:rPr>
-              <w:t>Diafragma y resorte</w:t>
+              <w:t>Piñón y cremallera (Rack and pinion)</w:t>
             </w:r>
           </w:p>
         </w:tc>
@@ -17559,7 +17636,7 @@
               <w:rPr>
                 <w:sz w:val="18"/>
               </w:rPr>
-              <w:t>Diafragma y resorte D-069 con palanca de 50,8 mm (2,000 in): área 445 cm² (69,0 in²)</w:t>
+              <w:t>Piñón y cremallera R-08 con retorno por resorte: 599 N·m (5.300 lbf·in) a 5,5 bar</w:t>
             </w:r>
           </w:p>
         </w:tc>
@@ -17606,7 +17683,7 @@
                 <w:b/>
                 <w:sz w:val="18"/>
               </w:rPr>
-              <w:t>Ajuste de banco (bench set)</w:t>
+              <w:t>Flow (sentido del flujo)</w:t>
             </w:r>
           </w:p>
         </w:tc>
@@ -17619,7 +17696,7 @@
               <w:rPr>
                 <w:sz w:val="18"/>
               </w:rPr>
-              <w:t>15,5 – 32,5 psig (1,07 – 2,24 bar g)</w:t>
+              <w:t>Unidireccional: cierra con presión en el sentido marcado en el cuerpo</w:t>
             </w:r>
           </w:p>
         </w:tc>
@@ -17636,7 +17713,7 @@
                 <w:b/>
                 <w:sz w:val="18"/>
               </w:rPr>
-              <w:t>Constante del resorte</w:t>
+              <w:t>Par de aire con aire mínimo</w:t>
             </w:r>
           </w:p>
         </w:tc>
@@ -17649,7 +17726,7 @@
               <w:rPr>
                 <w:sz w:val="18"/>
               </w:rPr>
-              <w:t>72,6 N/mm (415 lbf/in)</w:t>
+              <w:t>434 N·m (3.844 lbf·in)</w:t>
             </w:r>
           </w:p>
         </w:tc>
@@ -17666,7 +17743,7 @@
                 <w:b/>
                 <w:sz w:val="18"/>
               </w:rPr>
-              <w:t>Par de falla del resorte en el asiento</w:t>
+              <w:t>Par del resorte al final (posición de falla)</w:t>
             </w:r>
           </w:p>
         </w:tc>
@@ -17679,7 +17756,7 @@
               <w:rPr>
                 <w:sz w:val="18"/>
               </w:rPr>
-              <w:t>205 N·m (1.818 lbf·in)</w:t>
+              <w:t>199 N·m (1.765 lbf·in)</w:t>
             </w:r>
           </w:p>
         </w:tc>
@@ -17696,6 +17773,66 @@
                 <w:b/>
                 <w:sz w:val="18"/>
               </w:rPr>
+              <w:t>Par del resorte al comienzo</w:t>
+            </w:r>
+          </w:p>
+        </w:tc>
+        <w:tc>
+          <w:tcPr>
+            <w:tcW w:type="dxa" w:w="6412"/>
+          </w:tcPr>
+          <w:p>
+            <w:r>
+              <w:rPr>
+                <w:sz w:val="18"/>
+              </w:rPr>
+              <w:t>289 N·m (2.559 lbf·in)</w:t>
+            </w:r>
+          </w:p>
+        </w:tc>
+      </w:tr>
+      <w:tr>
+        <w:tc>
+          <w:tcPr>
+            <w:tcW w:type="dxa" w:w="3453"/>
+            <w:shd w:val="clear" w:color="auto" w:fill="EEF2F6"/>
+          </w:tcPr>
+          <w:p>
+            <w:r>
+              <w:rPr>
+                <w:b/>
+                <w:sz w:val="18"/>
+              </w:rPr>
+              <w:t>Par de aire al comienzo / al final</w:t>
+            </w:r>
+          </w:p>
+        </w:tc>
+        <w:tc>
+          <w:tcPr>
+            <w:tcW w:type="dxa" w:w="6412"/>
+          </w:tcPr>
+          <w:p>
+            <w:r>
+              <w:rPr>
+                <w:sz w:val="18"/>
+              </w:rPr>
+              <w:t>235 N·m (2.079 lbf·in) / 145 N·m (1.285 lbf·in)</w:t>
+            </w:r>
+          </w:p>
+        </w:tc>
+      </w:tr>
+      <w:tr>
+        <w:tc>
+          <w:tcPr>
+            <w:tcW w:type="dxa" w:w="3453"/>
+            <w:shd w:val="clear" w:color="auto" w:fill="EEF2F6"/>
+          </w:tcPr>
+          <w:p>
+            <w:r>
+              <w:rPr>
+                <w:b/>
+                <w:sz w:val="18"/>
+              </w:rPr>
               <w:t>Presión de aire requerida</w:t>
             </w:r>
           </w:p>
@@ -17709,7 +17846,7 @@
               <w:rPr>
                 <w:sz w:val="18"/>
               </w:rPr>
-              <w:t>3,28 bar g (47,5 psig)</w:t>
+              <w:t>3,67 bar g (53,3 psig)</w:t>
             </w:r>
           </w:p>
         </w:tc>

</xml_diff>

<commit_message>
v0.10.0: botones animados, buscador, trims anticavitación por etapas y actuador certificado
- Botones con hover/presionado y brillo en Calcular; celda de trim corta; carrera con unidad mm/in.
- Reportes sin columna de modo manual/automático.
- Buscador en el encabezado (datos, opciones y temas de ayuda).
- Trim anticavitación por etapas en líquidos: reparto de igual Kapp, factores equivalentes,
  ruido de la última etapa y etapas recomendadas.
- 4-Actuador: modo MANUAL con verificación del actuador certificado y fricción certificada
  de la empaquetadura.

Co-Authored-By: Claude Opus 5.5 (1M context) <noreply@anthropic.com>
Claude-Session: https://claude.ai/code/session_01U4yJ7uLSXttFganqs6AWmH
</commit_message>
<xml_diff>
--- a/kit_workshop/resultados_de_referencia/Caso_A_baja_agua_enfriamiento_mariposa_resultados_N25.docx
+++ b/kit_workshop/resultados_de_referencia/Caso_A_baja_agua_enfriamiento_mariposa_resultados_N25.docx
@@ -3014,6 +3014,7 @@
               <w:rPr>
                 <w:sz w:val="18"/>
               </w:rPr>
+              <w:t>°</w:t>
             </w:r>
           </w:p>
         </w:tc>
@@ -3030,7 +3031,7 @@
               <w:rPr>
                 <w:sz w:val="18"/>
               </w:rPr>
-              <w:t>19° de 90°</w:t>
+              <w:t>18,5</w:t>
             </w:r>
           </w:p>
         </w:tc>
@@ -3047,7 +3048,7 @@
               <w:rPr>
                 <w:sz w:val="18"/>
               </w:rPr>
-              <w:t>30° de 90°</w:t>
+              <w:t>29,8</w:t>
             </w:r>
           </w:p>
         </w:tc>
@@ -3064,7 +3065,7 @@
               <w:rPr>
                 <w:sz w:val="18"/>
               </w:rPr>
-              <w:t>48° de 90°</w:t>
+              <w:t>47,6</w:t>
             </w:r>
           </w:p>
         </w:tc>
@@ -3433,7 +3434,7 @@
               <w:rPr>
                 <w:sz w:val="18"/>
               </w:rPr>
-              <w:t>Carrera de operación</w:t>
+              <w:t>Rotación de operación</w:t>
             </w:r>
           </w:p>
         </w:tc>
@@ -3446,6 +3447,7 @@
               <w:rPr>
                 <w:sz w:val="18"/>
               </w:rPr>
+              <w:t>°</w:t>
             </w:r>
           </w:p>
         </w:tc>
@@ -3462,7 +3464,7 @@
               <w:rPr>
                 <w:sz w:val="18"/>
               </w:rPr>
-              <w:t>19° de 90°</w:t>
+              <w:t>18,5</w:t>
             </w:r>
           </w:p>
         </w:tc>
@@ -3479,7 +3481,7 @@
               <w:rPr>
                 <w:sz w:val="18"/>
               </w:rPr>
-              <w:t>30° de 90°</w:t>
+              <w:t>29,8</w:t>
             </w:r>
           </w:p>
         </w:tc>
@@ -3496,7 +3498,7 @@
               <w:rPr>
                 <w:sz w:val="18"/>
               </w:rPr>
-              <w:t>48° de 90°</w:t>
+              <w:t>47,6</w:t>
             </w:r>
           </w:p>
         </w:tc>
@@ -4049,6 +4051,84 @@
                 <w:sz w:val="18"/>
               </w:rPr>
               <w:t>cavitación incipiente</w:t>
+            </w:r>
+          </w:p>
+        </w:tc>
+      </w:tr>
+      <w:tr>
+        <w:tc>
+          <w:tcPr>
+            <w:tcW w:type="dxa" w:w="3749"/>
+          </w:tcPr>
+          <w:p>
+            <w:r>
+              <w:rPr>
+                <w:sz w:val="18"/>
+              </w:rPr>
+              <w:t>Etapas recomendadas: sin cavitación / incipiente</w:t>
+            </w:r>
+          </w:p>
+        </w:tc>
+        <w:tc>
+          <w:tcPr>
+            <w:tcW w:type="dxa" w:w="986"/>
+          </w:tcPr>
+          <w:p>
+            <w:r>
+              <w:rPr>
+                <w:sz w:val="18"/>
+              </w:rPr>
+            </w:r>
+          </w:p>
+        </w:tc>
+        <w:tc>
+          <w:tcPr>
+            <w:tcW w:type="dxa" w:w="1710"/>
+            <w:shd w:val="clear" w:color="auto" w:fill="E3F1E6"/>
+          </w:tcPr>
+          <w:p>
+            <w:pPr>
+              <w:jc w:val="right"/>
+            </w:pPr>
+            <w:r>
+              <w:rPr>
+                <w:sz w:val="18"/>
+              </w:rPr>
+              <w:t>1 / 1</w:t>
+            </w:r>
+          </w:p>
+        </w:tc>
+        <w:tc>
+          <w:tcPr>
+            <w:tcW w:type="dxa" w:w="1710"/>
+            <w:shd w:val="clear" w:color="auto" w:fill="E3F1E6"/>
+          </w:tcPr>
+          <w:p>
+            <w:pPr>
+              <w:jc w:val="right"/>
+            </w:pPr>
+            <w:r>
+              <w:rPr>
+                <w:sz w:val="18"/>
+              </w:rPr>
+              <w:t>1 / 1</w:t>
+            </w:r>
+          </w:p>
+        </w:tc>
+        <w:tc>
+          <w:tcPr>
+            <w:tcW w:type="dxa" w:w="1710"/>
+            <w:shd w:val="clear" w:color="auto" w:fill="E3F1E6"/>
+          </w:tcPr>
+          <w:p>
+            <w:pPr>
+              <w:jc w:val="right"/>
+            </w:pPr>
+            <w:r>
+              <w:rPr>
+                <w:sz w:val="18"/>
+              </w:rPr>
+              <w:t>1 / 1</w:t>
             </w:r>
           </w:p>
         </w:tc>
@@ -5738,7 +5818,7 @@
     </w:p>
     <w:p>
       <w:r>
-        <w:t>Cuerpo (AUTOMÁTICO): ASTM A216 WCB — acero al carbono fundido.</w:t>
+        <w:t>Cuerpo: ASTM A216 WCB — acero al carbono fundido.</w:t>
       </w:r>
     </w:p>
     <w:p>
@@ -5839,7 +5919,7 @@
     </w:p>
     <w:p>
       <w:r>
-        <w:t>Tapa / brida de eje (AUTOMÁTICO): ASTM A216 WCB — acero al carbono fundido.</w:t>
+        <w:t>Tapa / brida de eje: ASTM A216 WCB — acero al carbono fundido.</w:t>
       </w:r>
     </w:p>
     <w:p>
@@ -5876,7 +5956,7 @@
     </w:p>
     <w:p>
       <w:r>
-        <w:t>Anillo de asiento (AUTOMÁTICO): Stellite 6 macizo (Co-Cr-W, fundido o forjado 6B).</w:t>
+        <w:t>Anillo de asiento: Stellite 6 macizo (Co-Cr-W, fundido o forjado 6B).</w:t>
       </w:r>
     </w:p>
     <w:p>
@@ -5982,7 +6062,7 @@
     </w:p>
     <w:p>
       <w:r>
-        <w:t>Cojinetes del eje (AUTOMÁTICO): Inconel 718 (N07718) envejecido.</w:t>
+        <w:t>Cojinetes del eje: Inconel 718 (N07718) envejecido.</w:t>
       </w:r>
     </w:p>
     <w:p>
@@ -6075,7 +6155,7 @@
     </w:p>
     <w:p>
       <w:r>
-        <w:t>Bola / disco / obturador (AUTOMÁTICO): Inconel 718 (N07718) envejecido.</w:t>
+        <w:t>Bola / disco / obturador: Inconel 718 (N07718) envejecido.</w:t>
       </w:r>
     </w:p>
     <w:p>
@@ -6176,7 +6256,7 @@
     </w:p>
     <w:p>
       <w:r>
-        <w:t>Eje (AUTOMÁTICO): Dúplex 2205 (S31803 / S32205) barra.</w:t>
+        <w:t>Eje: Dúplex 2205 (S31803 / S32205) barra.</w:t>
       </w:r>
     </w:p>
     <w:p>
@@ -6614,7 +6694,7 @@
     </w:p>
     <w:p>
       <w:r>
-        <w:t>Elegida (AUTOMÁTICO): Anillos en V de PTFE, simple, con resorte. Bonete: Estándar (prensaestopas del eje). T de 32 a 65 °C dentro del rango de un prensaestopas del eje estándar.</w:t>
+        <w:t>Elegida: Anillos en V de PTFE, simple, con resorte. Bonete: Estándar (prensaestopas del eje). T de 32 a 65 °C dentro del rango de un prensaestopas del eje estándar.</w:t>
       </w:r>
     </w:p>
     <w:p>
@@ -9545,7 +9625,7 @@
               <w:rPr>
                 <w:sz w:val="18"/>
               </w:rPr>
-              <w:t>Carrera de operación</w:t>
+              <w:t>Rotación de operación</w:t>
             </w:r>
           </w:p>
         </w:tc>
@@ -9558,6 +9638,7 @@
               <w:rPr>
                 <w:sz w:val="18"/>
               </w:rPr>
+              <w:t>°</w:t>
             </w:r>
           </w:p>
         </w:tc>
@@ -9573,7 +9654,7 @@
               <w:rPr>
                 <w:sz w:val="18"/>
               </w:rPr>
-              <w:t>19° de 90°</w:t>
+              <w:t>18,5</w:t>
             </w:r>
           </w:p>
         </w:tc>
@@ -9589,7 +9670,7 @@
               <w:rPr>
                 <w:sz w:val="18"/>
               </w:rPr>
-              <w:t>30° de 90°</w:t>
+              <w:t>29,8</w:t>
             </w:r>
           </w:p>
         </w:tc>
@@ -9605,7 +9686,7 @@
               <w:rPr>
                 <w:sz w:val="18"/>
               </w:rPr>
-              <w:t>48° de 90°</w:t>
+              <w:t>47,6</w:t>
             </w:r>
           </w:p>
         </w:tc>
@@ -10729,7 +10810,7 @@
                 <w:b/>
                 <w:sz w:val="18"/>
               </w:rPr>
-              <w:t>Obturador</w:t>
+              <w:t>Trim anticavitación</w:t>
             </w:r>
           </w:p>
         </w:tc>
@@ -10742,7 +10823,7 @@
               <w:rPr>
                 <w:sz w:val="18"/>
               </w:rPr>
-              <w:t>No aplica (cuerpo rotativo)</w:t>
+              <w:t>Estándar (trim elegido, 1 etapa)</w:t>
             </w:r>
           </w:p>
         </w:tc>
@@ -10759,7 +10840,7 @@
                 <w:b/>
                 <w:sz w:val="18"/>
               </w:rPr>
-              <w:t>Característica inherente</w:t>
+              <w:t>Obturador</w:t>
             </w:r>
           </w:p>
         </w:tc>
@@ -10772,7 +10853,7 @@
               <w:rPr>
                 <w:sz w:val="18"/>
               </w:rPr>
-              <w:t>Lineal</w:t>
+              <w:t>No aplica (cuerpo rotativo)</w:t>
             </w:r>
           </w:p>
         </w:tc>
@@ -10789,7 +10870,7 @@
                 <w:b/>
                 <w:sz w:val="18"/>
               </w:rPr>
-              <w:t>Cv nominal (típico del tamaño y trim)</w:t>
+              <w:t>Característica inherente</w:t>
             </w:r>
           </w:p>
         </w:tc>
@@ -10802,7 +10883,7 @@
               <w:rPr>
                 <w:sz w:val="18"/>
               </w:rPr>
-              <w:t>1.920</w:t>
+              <w:t>Lineal</w:t>
             </w:r>
           </w:p>
         </w:tc>
@@ -10819,7 +10900,7 @@
                 <w:b/>
                 <w:sz w:val="18"/>
               </w:rPr>
-              <w:t>Diámetro del orificio / disco</w:t>
+              <w:t>Cv nominal (típico del tamaño y trim)</w:t>
             </w:r>
           </w:p>
         </w:tc>
@@ -10832,7 +10913,7 @@
               <w:rPr>
                 <w:sz w:val="18"/>
               </w:rPr>
-              <w:t>8 in (202,7 mm) estimado</w:t>
+              <w:t>1.920</w:t>
             </w:r>
           </w:p>
         </w:tc>
@@ -10849,7 +10930,7 @@
                 <w:b/>
                 <w:sz w:val="18"/>
               </w:rPr>
-              <w:t>Rotación nominal del eje</w:t>
+              <w:t>Diámetro del orificio / disco</w:t>
             </w:r>
           </w:p>
         </w:tc>
@@ -10862,7 +10943,7 @@
               <w:rPr>
                 <w:sz w:val="18"/>
               </w:rPr>
-              <w:t>Rotación nominal 90°</w:t>
+              <w:t>8 in (202,7 mm) estimado</w:t>
             </w:r>
           </w:p>
         </w:tc>
@@ -10879,6 +10960,36 @@
                 <w:b/>
                 <w:sz w:val="18"/>
               </w:rPr>
+              <w:t>Rotación nominal del eje</w:t>
+            </w:r>
+          </w:p>
+        </w:tc>
+        <w:tc>
+          <w:tcPr>
+            <w:tcW w:type="dxa" w:w="6412"/>
+          </w:tcPr>
+          <w:p>
+            <w:r>
+              <w:rPr>
+                <w:sz w:val="18"/>
+              </w:rPr>
+              <w:t>Rotación nominal 90°</w:t>
+            </w:r>
+          </w:p>
+        </w:tc>
+      </w:tr>
+      <w:tr>
+        <w:tc>
+          <w:tcPr>
+            <w:tcW w:type="dxa" w:w="3453"/>
+            <w:shd w:val="clear" w:color="auto" w:fill="EEF2F6"/>
+          </w:tcPr>
+          <w:p>
+            <w:r>
+              <w:rPr>
+                <w:b/>
+                <w:sz w:val="18"/>
+              </w:rPr>
               <w:t>Rotación de operación</w:t>
             </w:r>
           </w:p>
@@ -10892,7 +11003,7 @@
               <w:rPr>
                 <w:sz w:val="18"/>
               </w:rPr>
-              <w:t>Mínimo: 19° de 90° · Normal: 30° de 90° · Máximo: 48° de 90°</w:t>
+              <w:t>Mínimo: 18,5 ° · Normal: 29,8 ° · Máximo: 47,6 °</w:t>
             </w:r>
           </w:p>
         </w:tc>
@@ -14135,7 +14246,7 @@
               <w:rPr>
                 <w:sz w:val="18"/>
               </w:rPr>
-              <w:t>Carrera de operación</w:t>
+              <w:t>Rotación de operación</w:t>
             </w:r>
           </w:p>
         </w:tc>
@@ -14148,6 +14259,7 @@
               <w:rPr>
                 <w:sz w:val="18"/>
               </w:rPr>
+              <w:t>°</w:t>
             </w:r>
           </w:p>
         </w:tc>
@@ -14164,7 +14276,7 @@
               <w:rPr>
                 <w:sz w:val="18"/>
               </w:rPr>
-              <w:t>19° de 90°</w:t>
+              <w:t>18,5</w:t>
             </w:r>
           </w:p>
         </w:tc>
@@ -14181,7 +14293,7 @@
               <w:rPr>
                 <w:sz w:val="18"/>
               </w:rPr>
-              <w:t>30° de 90°</w:t>
+              <w:t>29,8</w:t>
             </w:r>
           </w:p>
         </w:tc>
@@ -14198,7 +14310,7 @@
               <w:rPr>
                 <w:sz w:val="18"/>
               </w:rPr>
-              <w:t>48° de 90°</w:t>
+              <w:t>47,6</w:t>
             </w:r>
           </w:p>
         </w:tc>
@@ -14751,6 +14863,84 @@
                 <w:sz w:val="18"/>
               </w:rPr>
               <w:t>cavitación incipiente</w:t>
+            </w:r>
+          </w:p>
+        </w:tc>
+      </w:tr>
+      <w:tr>
+        <w:tc>
+          <w:tcPr>
+            <w:tcW w:type="dxa" w:w="3749"/>
+          </w:tcPr>
+          <w:p>
+            <w:r>
+              <w:rPr>
+                <w:sz w:val="18"/>
+              </w:rPr>
+              <w:t>Etapas recomendadas: sin cavitación / incipiente</w:t>
+            </w:r>
+          </w:p>
+        </w:tc>
+        <w:tc>
+          <w:tcPr>
+            <w:tcW w:type="dxa" w:w="986"/>
+          </w:tcPr>
+          <w:p>
+            <w:r>
+              <w:rPr>
+                <w:sz w:val="18"/>
+              </w:rPr>
+            </w:r>
+          </w:p>
+        </w:tc>
+        <w:tc>
+          <w:tcPr>
+            <w:tcW w:type="dxa" w:w="1710"/>
+            <w:shd w:val="clear" w:color="auto" w:fill="E3F1E6"/>
+          </w:tcPr>
+          <w:p>
+            <w:pPr>
+              <w:jc w:val="right"/>
+            </w:pPr>
+            <w:r>
+              <w:rPr>
+                <w:sz w:val="18"/>
+              </w:rPr>
+              <w:t>1 / 1</w:t>
+            </w:r>
+          </w:p>
+        </w:tc>
+        <w:tc>
+          <w:tcPr>
+            <w:tcW w:type="dxa" w:w="1710"/>
+            <w:shd w:val="clear" w:color="auto" w:fill="E3F1E6"/>
+          </w:tcPr>
+          <w:p>
+            <w:pPr>
+              <w:jc w:val="right"/>
+            </w:pPr>
+            <w:r>
+              <w:rPr>
+                <w:sz w:val="18"/>
+              </w:rPr>
+              <w:t>1 / 1</w:t>
+            </w:r>
+          </w:p>
+        </w:tc>
+        <w:tc>
+          <w:tcPr>
+            <w:tcW w:type="dxa" w:w="1710"/>
+            <w:shd w:val="clear" w:color="auto" w:fill="E3F1E6"/>
+          </w:tcPr>
+          <w:p>
+            <w:pPr>
+              <w:jc w:val="right"/>
+            </w:pPr>
+            <w:r>
+              <w:rPr>
+                <w:sz w:val="18"/>
+              </w:rPr>
+              <w:t>1 / 1</w:t>
             </w:r>
           </w:p>
         </w:tc>
@@ -16165,16 +16355,15 @@
         <w:tblLook w:firstColumn="1" w:firstRow="1" w:lastColumn="0" w:lastRow="0" w:noHBand="0" w:noVBand="1" w:val="04A0"/>
       </w:tblPr>
       <w:tblGrid>
-        <w:gridCol w:w="1973"/>
-        <w:gridCol w:w="1973"/>
-        <w:gridCol w:w="1973"/>
-        <w:gridCol w:w="1973"/>
-        <w:gridCol w:w="1973"/>
+        <w:gridCol w:w="2466"/>
+        <w:gridCol w:w="2466"/>
+        <w:gridCol w:w="2466"/>
+        <w:gridCol w:w="2466"/>
       </w:tblGrid>
       <w:tr>
         <w:tc>
           <w:tcPr>
-            <w:tcW w:type="dxa" w:w="1282"/>
+            <w:tcW w:type="dxa" w:w="1480"/>
             <w:shd w:val="clear" w:color="auto" w:fill="0D3B66"/>
           </w:tcPr>
           <w:p>
@@ -16190,7 +16379,7 @@
         </w:tc>
         <w:tc>
           <w:tcPr>
-            <w:tcW w:type="dxa" w:w="1085"/>
+            <w:tcW w:type="dxa" w:w="2959"/>
             <w:shd w:val="clear" w:color="auto" w:fill="0D3B66"/>
           </w:tcPr>
           <w:p>
@@ -16200,13 +16389,13 @@
                 <w:color w:val="FFFFFF"/>
                 <w:sz w:val="18"/>
               </w:rPr>
-              <w:t>Modo</w:t>
-            </w:r>
-          </w:p>
-        </w:tc>
-        <w:tc>
-          <w:tcPr>
-            <w:tcW w:type="dxa" w:w="2565"/>
+              <w:t>Material</w:t>
+            </w:r>
+          </w:p>
+        </w:tc>
+        <w:tc>
+          <w:tcPr>
+            <w:tcW w:type="dxa" w:w="1184"/>
             <w:shd w:val="clear" w:color="auto" w:fill="0D3B66"/>
           </w:tcPr>
           <w:p>
@@ -16216,13 +16405,13 @@
                 <w:color w:val="FFFFFF"/>
                 <w:sz w:val="18"/>
               </w:rPr>
-              <w:t>Material</w:t>
-            </w:r>
-          </w:p>
-        </w:tc>
-        <w:tc>
-          <w:tcPr>
-            <w:tcW w:type="dxa" w:w="1085"/>
+              <w:t>Dureza</w:t>
+            </w:r>
+          </w:p>
+        </w:tc>
+        <w:tc>
+          <w:tcPr>
+            <w:tcW w:type="dxa" w:w="4242"/>
             <w:shd w:val="clear" w:color="auto" w:fill="0D3B66"/>
           </w:tcPr>
           <w:p>
@@ -16232,22 +16421,6 @@
                 <w:color w:val="FFFFFF"/>
                 <w:sz w:val="18"/>
               </w:rPr>
-              <w:t>Dureza</w:t>
-            </w:r>
-          </w:p>
-        </w:tc>
-        <w:tc>
-          <w:tcPr>
-            <w:tcW w:type="dxa" w:w="3847"/>
-            <w:shd w:val="clear" w:color="auto" w:fill="0D3B66"/>
-          </w:tcPr>
-          <w:p>
-            <w:r>
-              <w:rPr>
-                <w:b/>
-                <w:color w:val="FFFFFF"/>
-                <w:sz w:val="18"/>
-              </w:rPr>
               <w:t>Justificación</w:t>
             </w:r>
           </w:p>
@@ -16256,7 +16429,7 @@
       <w:tr>
         <w:tc>
           <w:tcPr>
-            <w:tcW w:type="dxa" w:w="1282"/>
+            <w:tcW w:type="dxa" w:w="1480"/>
           </w:tcPr>
           <w:p>
             <w:r>
@@ -16269,20 +16442,20 @@
         </w:tc>
         <w:tc>
           <w:tcPr>
-            <w:tcW w:type="dxa" w:w="1085"/>
-          </w:tcPr>
-          <w:p>
-            <w:r>
-              <w:rPr>
-                <w:sz w:val="18"/>
-              </w:rPr>
-              <w:t>AUTOMÁTICO</w:t>
-            </w:r>
-          </w:p>
-        </w:tc>
-        <w:tc>
-          <w:tcPr>
-            <w:tcW w:type="dxa" w:w="2565"/>
+            <w:tcW w:type="dxa" w:w="2959"/>
+          </w:tcPr>
+          <w:p>
+            <w:r>
+              <w:rPr>
+                <w:sz w:val="18"/>
+              </w:rPr>
+              <w:t>ASTM A216 WCB — acero al carbono fundido</w:t>
+            </w:r>
+          </w:p>
+        </w:tc>
+        <w:tc>
+          <w:tcPr>
+            <w:tcW w:type="dxa" w:w="1184"/>
           </w:tcPr>
           <w:p>
             <w:pPr>
@@ -16292,13 +16465,13 @@
               <w:rPr>
                 <w:sz w:val="18"/>
               </w:rPr>
-              <w:t>ASTM A216 WCB — acero al carbono fundido</w:t>
-            </w:r>
-          </w:p>
-        </w:tc>
-        <w:tc>
-          <w:tcPr>
-            <w:tcW w:type="dxa" w:w="1085"/>
+              <w:t>150 HB</w:t>
+            </w:r>
+          </w:p>
+        </w:tc>
+        <w:tc>
+          <w:tcPr>
+            <w:tcW w:type="dxa" w:w="4242"/>
           </w:tcPr>
           <w:p>
             <w:pPr>
@@ -16308,13 +16481,41 @@
               <w:rPr>
                 <w:sz w:val="18"/>
               </w:rPr>
-              <w:t>150 HB</w:t>
-            </w:r>
-          </w:p>
-        </w:tc>
-        <w:tc>
-          <w:tcPr>
-            <w:tcW w:type="dxa" w:w="3847"/>
+              <w:t>Seleccionado: ASTM A216 WCB — acero al carbono fundido (UNS J03002; ASTM A216 Gr. WCB).; Temperatura del servicio 32 a 65 °C dentro del rango del material (-29 a 538 °C).; Compatibilidad química global: B — bueno.</w:t>
+            </w:r>
+          </w:p>
+        </w:tc>
+      </w:tr>
+      <w:tr>
+        <w:tc>
+          <w:tcPr>
+            <w:tcW w:type="dxa" w:w="1480"/>
+          </w:tcPr>
+          <w:p>
+            <w:r>
+              <w:rPr>
+                <w:sz w:val="18"/>
+              </w:rPr>
+              <w:t>Tapa / brida de eje</w:t>
+            </w:r>
+          </w:p>
+        </w:tc>
+        <w:tc>
+          <w:tcPr>
+            <w:tcW w:type="dxa" w:w="2959"/>
+          </w:tcPr>
+          <w:p>
+            <w:r>
+              <w:rPr>
+                <w:sz w:val="18"/>
+              </w:rPr>
+              <w:t>ASTM A216 WCB — acero al carbono fundido</w:t>
+            </w:r>
+          </w:p>
+        </w:tc>
+        <w:tc>
+          <w:tcPr>
+            <w:tcW w:type="dxa" w:w="1184"/>
           </w:tcPr>
           <w:p>
             <w:pPr>
@@ -16324,41 +16525,13 @@
               <w:rPr>
                 <w:sz w:val="18"/>
               </w:rPr>
-              <w:t>Seleccionado: ASTM A216 WCB — acero al carbono fundido (UNS J03002; ASTM A216 Gr. WCB).; Temperatura del servicio 32 a 65 °C dentro del rango del material (-29 a 538 °C).; Compatibilidad química global: B — bueno.</w:t>
-            </w:r>
-          </w:p>
-        </w:tc>
-      </w:tr>
-      <w:tr>
-        <w:tc>
-          <w:tcPr>
-            <w:tcW w:type="dxa" w:w="1282"/>
-          </w:tcPr>
-          <w:p>
-            <w:r>
-              <w:rPr>
-                <w:sz w:val="18"/>
-              </w:rPr>
-              <w:t>Tapa / brida de eje</w:t>
-            </w:r>
-          </w:p>
-        </w:tc>
-        <w:tc>
-          <w:tcPr>
-            <w:tcW w:type="dxa" w:w="1085"/>
-          </w:tcPr>
-          <w:p>
-            <w:r>
-              <w:rPr>
-                <w:sz w:val="18"/>
-              </w:rPr>
-              <w:t>AUTOMÁTICO</w:t>
-            </w:r>
-          </w:p>
-        </w:tc>
-        <w:tc>
-          <w:tcPr>
-            <w:tcW w:type="dxa" w:w="2565"/>
+              <w:t>150 HB</w:t>
+            </w:r>
+          </w:p>
+        </w:tc>
+        <w:tc>
+          <w:tcPr>
+            <w:tcW w:type="dxa" w:w="4242"/>
           </w:tcPr>
           <w:p>
             <w:pPr>
@@ -16368,13 +16541,41 @@
               <w:rPr>
                 <w:sz w:val="18"/>
               </w:rPr>
-              <w:t>ASTM A216 WCB — acero al carbono fundido</w:t>
-            </w:r>
-          </w:p>
-        </w:tc>
-        <w:tc>
-          <w:tcPr>
-            <w:tcW w:type="dxa" w:w="1085"/>
+              <w:t>El bonete se especifica del mismo material que el cuerpo (ASTM A216 WCB — acero al carbono fundido) o de su equivalente forjado (A105 (forja)), con el mismo grupo de ASME B16.34 y la misma resistencia química.</w:t>
+            </w:r>
+          </w:p>
+        </w:tc>
+      </w:tr>
+      <w:tr>
+        <w:tc>
+          <w:tcPr>
+            <w:tcW w:type="dxa" w:w="1480"/>
+          </w:tcPr>
+          <w:p>
+            <w:r>
+              <w:rPr>
+                <w:sz w:val="18"/>
+              </w:rPr>
+              <w:t>Anillo de asiento</w:t>
+            </w:r>
+          </w:p>
+        </w:tc>
+        <w:tc>
+          <w:tcPr>
+            <w:tcW w:type="dxa" w:w="2959"/>
+          </w:tcPr>
+          <w:p>
+            <w:r>
+              <w:rPr>
+                <w:sz w:val="18"/>
+              </w:rPr>
+              <w:t>Stellite 6 macizo (Co-Cr-W, fundido o forjado 6B)</w:t>
+            </w:r>
+          </w:p>
+        </w:tc>
+        <w:tc>
+          <w:tcPr>
+            <w:tcW w:type="dxa" w:w="1184"/>
           </w:tcPr>
           <w:p>
             <w:pPr>
@@ -16384,13 +16585,13 @@
               <w:rPr>
                 <w:sz w:val="18"/>
               </w:rPr>
-              <w:t>150 HB</w:t>
-            </w:r>
-          </w:p>
-        </w:tc>
-        <w:tc>
-          <w:tcPr>
-            <w:tcW w:type="dxa" w:w="3847"/>
+              <w:t>40 HRC (≈ 371 HB)</w:t>
+            </w:r>
+          </w:p>
+        </w:tc>
+        <w:tc>
+          <w:tcPr>
+            <w:tcW w:type="dxa" w:w="4242"/>
           </w:tcPr>
           <w:p>
             <w:pPr>
@@ -16400,7 +16601,7 @@
               <w:rPr>
                 <w:sz w:val="18"/>
               </w:rPr>
-              <w:t>El bonete se especifica del mismo material que el cuerpo (ASTM A216 WCB — acero al carbono fundido) o de su equivalente forjado (A105 (forja)), con el mismo grupo de ASME B16.34 y la misma resistencia química.</w:t>
+              <w:t>Seleccionado: Stellite 6 macizo (Co-Cr-W, fundido o forjado 6B) (UNS R30006 / R30016; AMS 5387 / AMS 5894 (6B)).; Temperatura del servicio 32 a 65 °C dentro del rango del material (-273 a 816 °C).; Compatibilidad química global: B — bueno.</w:t>
             </w:r>
           </w:p>
         </w:tc>
@@ -16408,33 +16609,33 @@
       <w:tr>
         <w:tc>
           <w:tcPr>
-            <w:tcW w:type="dxa" w:w="1282"/>
-          </w:tcPr>
-          <w:p>
-            <w:r>
-              <w:rPr>
-                <w:sz w:val="18"/>
-              </w:rPr>
-              <w:t>Anillo de asiento</w:t>
-            </w:r>
-          </w:p>
-        </w:tc>
-        <w:tc>
-          <w:tcPr>
-            <w:tcW w:type="dxa" w:w="1085"/>
-          </w:tcPr>
-          <w:p>
-            <w:r>
-              <w:rPr>
-                <w:sz w:val="18"/>
-              </w:rPr>
-              <w:t>AUTOMÁTICO</w:t>
-            </w:r>
-          </w:p>
-        </w:tc>
-        <w:tc>
-          <w:tcPr>
-            <w:tcW w:type="dxa" w:w="2565"/>
+            <w:tcW w:type="dxa" w:w="1480"/>
+          </w:tcPr>
+          <w:p>
+            <w:r>
+              <w:rPr>
+                <w:sz w:val="18"/>
+              </w:rPr>
+              <w:t>Atenuador / jaula (si lleva)</w:t>
+            </w:r>
+          </w:p>
+        </w:tc>
+        <w:tc>
+          <w:tcPr>
+            <w:tcW w:type="dxa" w:w="2959"/>
+          </w:tcPr>
+          <w:p>
+            <w:r>
+              <w:rPr>
+                <w:sz w:val="18"/>
+              </w:rPr>
+              <w:t>No aplica</w:t>
+            </w:r>
+          </w:p>
+        </w:tc>
+        <w:tc>
+          <w:tcPr>
+            <w:tcW w:type="dxa" w:w="1184"/>
           </w:tcPr>
           <w:p>
             <w:pPr>
@@ -16444,13 +16645,13 @@
               <w:rPr>
                 <w:sz w:val="18"/>
               </w:rPr>
-              <w:t>Stellite 6 macizo (Co-Cr-W, fundido o forjado 6B)</w:t>
-            </w:r>
-          </w:p>
-        </w:tc>
-        <w:tc>
-          <w:tcPr>
-            <w:tcW w:type="dxa" w:w="1085"/>
+              <w:t>—</w:t>
+            </w:r>
+          </w:p>
+        </w:tc>
+        <w:tc>
+          <w:tcPr>
+            <w:tcW w:type="dxa" w:w="4242"/>
           </w:tcPr>
           <w:p>
             <w:pPr>
@@ -16460,13 +16661,40 @@
               <w:rPr>
                 <w:sz w:val="18"/>
               </w:rPr>
-              <w:t>40 HRC (≈ 371 HB)</w:t>
-            </w:r>
-          </w:p>
-        </w:tc>
-        <w:tc>
-          <w:tcPr>
-            <w:tcW w:type="dxa" w:w="3847"/>
+            </w:r>
+          </w:p>
+        </w:tc>
+      </w:tr>
+      <w:tr>
+        <w:tc>
+          <w:tcPr>
+            <w:tcW w:type="dxa" w:w="1480"/>
+          </w:tcPr>
+          <w:p>
+            <w:r>
+              <w:rPr>
+                <w:sz w:val="18"/>
+              </w:rPr>
+              <w:t>Cojinetes del eje</w:t>
+            </w:r>
+          </w:p>
+        </w:tc>
+        <w:tc>
+          <w:tcPr>
+            <w:tcW w:type="dxa" w:w="2959"/>
+          </w:tcPr>
+          <w:p>
+            <w:r>
+              <w:rPr>
+                <w:sz w:val="18"/>
+              </w:rPr>
+              <w:t>Inconel 718 (N07718) envejecido</w:t>
+            </w:r>
+          </w:p>
+        </w:tc>
+        <w:tc>
+          <w:tcPr>
+            <w:tcW w:type="dxa" w:w="1184"/>
           </w:tcPr>
           <w:p>
             <w:pPr>
@@ -16476,41 +16704,13 @@
               <w:rPr>
                 <w:sz w:val="18"/>
               </w:rPr>
-              <w:t>Seleccionado: Stellite 6 macizo (Co-Cr-W, fundido o forjado 6B) (UNS R30006 / R30016; AMS 5387 / AMS 5894 (6B)).; Temperatura del servicio 32 a 65 °C dentro del rango del material (-273 a 816 °C).; Compatibilidad química global: B — bueno.</w:t>
-            </w:r>
-          </w:p>
-        </w:tc>
-      </w:tr>
-      <w:tr>
-        <w:tc>
-          <w:tcPr>
-            <w:tcW w:type="dxa" w:w="1282"/>
-          </w:tcPr>
-          <w:p>
-            <w:r>
-              <w:rPr>
-                <w:sz w:val="18"/>
-              </w:rPr>
-              <w:t>Atenuador / jaula (si lleva)</w:t>
-            </w:r>
-          </w:p>
-        </w:tc>
-        <w:tc>
-          <w:tcPr>
-            <w:tcW w:type="dxa" w:w="1085"/>
-          </w:tcPr>
-          <w:p>
-            <w:r>
-              <w:rPr>
-                <w:sz w:val="18"/>
-              </w:rPr>
-              <w:t>—</w:t>
-            </w:r>
-          </w:p>
-        </w:tc>
-        <w:tc>
-          <w:tcPr>
-            <w:tcW w:type="dxa" w:w="2565"/>
+              <w:t>38 HRC (≈ 353 HB)</w:t>
+            </w:r>
+          </w:p>
+        </w:tc>
+        <w:tc>
+          <w:tcPr>
+            <w:tcW w:type="dxa" w:w="4242"/>
           </w:tcPr>
           <w:p>
             <w:pPr>
@@ -16520,13 +16720,41 @@
               <w:rPr>
                 <w:sz w:val="18"/>
               </w:rPr>
-              <w:t>No aplica</w:t>
-            </w:r>
-          </w:p>
-        </w:tc>
-        <w:tc>
-          <w:tcPr>
-            <w:tcW w:type="dxa" w:w="1085"/>
+              <w:t>Seleccionado: Inconel 718 (N07718) envejecido (UNS N07718; ASTM B637 N07718 / API 6A718).; Temperatura del servicio 32 a 65 °C dentro del rango del material (-198 a 650 °C).; Compatibilidad química global: A — excelente.</w:t>
+            </w:r>
+          </w:p>
+        </w:tc>
+      </w:tr>
+      <w:tr>
+        <w:tc>
+          <w:tcPr>
+            <w:tcW w:type="dxa" w:w="1480"/>
+          </w:tcPr>
+          <w:p>
+            <w:r>
+              <w:rPr>
+                <w:sz w:val="18"/>
+              </w:rPr>
+              <w:t>Bola / disco / obturador</w:t>
+            </w:r>
+          </w:p>
+        </w:tc>
+        <w:tc>
+          <w:tcPr>
+            <w:tcW w:type="dxa" w:w="2959"/>
+          </w:tcPr>
+          <w:p>
+            <w:r>
+              <w:rPr>
+                <w:sz w:val="18"/>
+              </w:rPr>
+              <w:t>Inconel 718 (N07718) envejecido</w:t>
+            </w:r>
+          </w:p>
+        </w:tc>
+        <w:tc>
+          <w:tcPr>
+            <w:tcW w:type="dxa" w:w="1184"/>
           </w:tcPr>
           <w:p>
             <w:pPr>
@@ -16536,13 +16764,13 @@
               <w:rPr>
                 <w:sz w:val="18"/>
               </w:rPr>
-              <w:t>—</w:t>
-            </w:r>
-          </w:p>
-        </w:tc>
-        <w:tc>
-          <w:tcPr>
-            <w:tcW w:type="dxa" w:w="3847"/>
+              <w:t>38 HRC (≈ 353 HB)</w:t>
+            </w:r>
+          </w:p>
+        </w:tc>
+        <w:tc>
+          <w:tcPr>
+            <w:tcW w:type="dxa" w:w="4242"/>
           </w:tcPr>
           <w:p>
             <w:pPr>
@@ -16552,6 +16780,7 @@
               <w:rPr>
                 <w:sz w:val="18"/>
               </w:rPr>
+              <w:t>Seleccionado: Inconel 718 (N07718) envejecido (UNS N07718; ASTM B637 N07718 / API 6A718).; Temperatura del servicio 32 a 65 °C dentro del rango del material (-198 a 650 °C).; Compatibilidad química global: A — excelente.</w:t>
             </w:r>
           </w:p>
         </w:tc>
@@ -16559,33 +16788,33 @@
       <w:tr>
         <w:tc>
           <w:tcPr>
-            <w:tcW w:type="dxa" w:w="1282"/>
-          </w:tcPr>
-          <w:p>
-            <w:r>
-              <w:rPr>
-                <w:sz w:val="18"/>
-              </w:rPr>
-              <w:t>Cojinetes del eje</w:t>
-            </w:r>
-          </w:p>
-        </w:tc>
-        <w:tc>
-          <w:tcPr>
-            <w:tcW w:type="dxa" w:w="1085"/>
-          </w:tcPr>
-          <w:p>
-            <w:r>
-              <w:rPr>
-                <w:sz w:val="18"/>
-              </w:rPr>
-              <w:t>AUTOMÁTICO</w:t>
-            </w:r>
-          </w:p>
-        </w:tc>
-        <w:tc>
-          <w:tcPr>
-            <w:tcW w:type="dxa" w:w="2565"/>
+            <w:tcW w:type="dxa" w:w="1480"/>
+          </w:tcPr>
+          <w:p>
+            <w:r>
+              <w:rPr>
+                <w:sz w:val="18"/>
+              </w:rPr>
+              <w:t>Eje</w:t>
+            </w:r>
+          </w:p>
+        </w:tc>
+        <w:tc>
+          <w:tcPr>
+            <w:tcW w:type="dxa" w:w="2959"/>
+          </w:tcPr>
+          <w:p>
+            <w:r>
+              <w:rPr>
+                <w:sz w:val="18"/>
+              </w:rPr>
+              <w:t>Dúplex 2205 (S31803 / S32205) barra</w:t>
+            </w:r>
+          </w:p>
+        </w:tc>
+        <w:tc>
+          <w:tcPr>
+            <w:tcW w:type="dxa" w:w="1184"/>
           </w:tcPr>
           <w:p>
             <w:pPr>
@@ -16595,181 +16824,13 @@
               <w:rPr>
                 <w:sz w:val="18"/>
               </w:rPr>
-              <w:t>Inconel 718 (N07718) envejecido</w:t>
-            </w:r>
-          </w:p>
-        </w:tc>
-        <w:tc>
-          <w:tcPr>
-            <w:tcW w:type="dxa" w:w="1085"/>
-          </w:tcPr>
-          <w:p>
-            <w:pPr>
-              <w:jc w:val="right"/>
-            </w:pPr>
-            <w:r>
-              <w:rPr>
-                <w:sz w:val="18"/>
-              </w:rPr>
-              <w:t>38 HRC (≈ 353 HB)</w:t>
-            </w:r>
-          </w:p>
-        </w:tc>
-        <w:tc>
-          <w:tcPr>
-            <w:tcW w:type="dxa" w:w="3847"/>
-          </w:tcPr>
-          <w:p>
-            <w:pPr>
-              <w:jc w:val="right"/>
-            </w:pPr>
-            <w:r>
-              <w:rPr>
-                <w:sz w:val="18"/>
-              </w:rPr>
-              <w:t>Seleccionado: Inconel 718 (N07718) envejecido (UNS N07718; ASTM B637 N07718 / API 6A718).; Temperatura del servicio 32 a 65 °C dentro del rango del material (-198 a 650 °C).; Compatibilidad química global: A — excelente.</w:t>
-            </w:r>
-          </w:p>
-        </w:tc>
-      </w:tr>
-      <w:tr>
-        <w:tc>
-          <w:tcPr>
-            <w:tcW w:type="dxa" w:w="1282"/>
-          </w:tcPr>
-          <w:p>
-            <w:r>
-              <w:rPr>
-                <w:sz w:val="18"/>
-              </w:rPr>
-              <w:t>Bola / disco / obturador</w:t>
-            </w:r>
-          </w:p>
-        </w:tc>
-        <w:tc>
-          <w:tcPr>
-            <w:tcW w:type="dxa" w:w="1085"/>
-          </w:tcPr>
-          <w:p>
-            <w:r>
-              <w:rPr>
-                <w:sz w:val="18"/>
-              </w:rPr>
-              <w:t>AUTOMÁTICO</w:t>
-            </w:r>
-          </w:p>
-        </w:tc>
-        <w:tc>
-          <w:tcPr>
-            <w:tcW w:type="dxa" w:w="2565"/>
-          </w:tcPr>
-          <w:p>
-            <w:pPr>
-              <w:jc w:val="right"/>
-            </w:pPr>
-            <w:r>
-              <w:rPr>
-                <w:sz w:val="18"/>
-              </w:rPr>
-              <w:t>Inconel 718 (N07718) envejecido</w:t>
-            </w:r>
-          </w:p>
-        </w:tc>
-        <w:tc>
-          <w:tcPr>
-            <w:tcW w:type="dxa" w:w="1085"/>
-          </w:tcPr>
-          <w:p>
-            <w:pPr>
-              <w:jc w:val="right"/>
-            </w:pPr>
-            <w:r>
-              <w:rPr>
-                <w:sz w:val="18"/>
-              </w:rPr>
-              <w:t>38 HRC (≈ 353 HB)</w:t>
-            </w:r>
-          </w:p>
-        </w:tc>
-        <w:tc>
-          <w:tcPr>
-            <w:tcW w:type="dxa" w:w="3847"/>
-          </w:tcPr>
-          <w:p>
-            <w:pPr>
-              <w:jc w:val="right"/>
-            </w:pPr>
-            <w:r>
-              <w:rPr>
-                <w:sz w:val="18"/>
-              </w:rPr>
-              <w:t>Seleccionado: Inconel 718 (N07718) envejecido (UNS N07718; ASTM B637 N07718 / API 6A718).; Temperatura del servicio 32 a 65 °C dentro del rango del material (-198 a 650 °C).; Compatibilidad química global: A — excelente.</w:t>
-            </w:r>
-          </w:p>
-        </w:tc>
-      </w:tr>
-      <w:tr>
-        <w:tc>
-          <w:tcPr>
-            <w:tcW w:type="dxa" w:w="1282"/>
-          </w:tcPr>
-          <w:p>
-            <w:r>
-              <w:rPr>
-                <w:sz w:val="18"/>
-              </w:rPr>
-              <w:t>Eje</w:t>
-            </w:r>
-          </w:p>
-        </w:tc>
-        <w:tc>
-          <w:tcPr>
-            <w:tcW w:type="dxa" w:w="1085"/>
-          </w:tcPr>
-          <w:p>
-            <w:r>
-              <w:rPr>
-                <w:sz w:val="18"/>
-              </w:rPr>
-              <w:t>AUTOMÁTICO</w:t>
-            </w:r>
-          </w:p>
-        </w:tc>
-        <w:tc>
-          <w:tcPr>
-            <w:tcW w:type="dxa" w:w="2565"/>
-          </w:tcPr>
-          <w:p>
-            <w:pPr>
-              <w:jc w:val="right"/>
-            </w:pPr>
-            <w:r>
-              <w:rPr>
-                <w:sz w:val="18"/>
-              </w:rPr>
-              <w:t>Dúplex 2205 (S31803 / S32205) barra</w:t>
-            </w:r>
-          </w:p>
-        </w:tc>
-        <w:tc>
-          <w:tcPr>
-            <w:tcW w:type="dxa" w:w="1085"/>
-          </w:tcPr>
-          <w:p>
-            <w:pPr>
-              <w:jc w:val="right"/>
-            </w:pPr>
-            <w:r>
-              <w:rPr>
-                <w:sz w:val="18"/>
-              </w:rPr>
               <w:t>250 HB</w:t>
             </w:r>
           </w:p>
         </w:tc>
         <w:tc>
           <w:tcPr>
-            <w:tcW w:type="dxa" w:w="3847"/>
+            <w:tcW w:type="dxa" w:w="4242"/>
           </w:tcPr>
           <w:p>
             <w:pPr>
@@ -17117,7 +17178,7 @@
               <w:rPr>
                 <w:sz w:val="18"/>
               </w:rPr>
-              <w:t>Anillos en V de PTFE, simple, con resorte (AUTOMÁTICO)</w:t>
+              <w:t>Anillos en V de PTFE, simple, con resorte</w:t>
             </w:r>
           </w:p>
         </w:tc>
@@ -18229,7 +18290,7 @@
         <w:pStyle w:val="ListBullet"/>
       </w:pPr>
       <w:r>
-        <w:t>Calculado con N25 Valves Sizing 0.9.0 de INSTRUMATIK S.A.S.. Software independiente de fabricantes.</w:t>
+        <w:t>Calculado con N25 Valves Sizing 0.10.0 de INSTRUMATIK S.A.S.. Software independiente de fabricantes.</w:t>
       </w:r>
     </w:p>
     <w:sectPr>
@@ -18255,7 +18316,7 @@
       <w:rPr>
         <w:sz w:val="16"/>
       </w:rPr>
-      <w:t xml:space="preserve">N25 Valves Sizing 0.9.0 · Página </w:t>
+      <w:t xml:space="preserve">N25 Valves Sizing 0.10.0 · Página </w:t>
     </w:r>
     <w:r>
       <w:fldChar w:fldCharType="begin"/>

</xml_diff>

<commit_message>
v0.10.1: puerto pleno típico de globo y ángulo por tabla de diámetro nominal
Co-Authored-By: Claude Opus 5.5 (1M context) <noreply@anthropic.com>
Claude-Session: https://claude.ai/code/session_01U4yJ7uLSXttFganqs6AWmH
</commit_message>
<xml_diff>
--- a/kit_workshop/resultados_de_referencia/Caso_A_baja_agua_enfriamiento_mariposa_resultados_N25.docx
+++ b/kit_workshop/resultados_de_referencia/Caso_A_baja_agua_enfriamiento_mariposa_resultados_N25.docx
@@ -18290,7 +18290,7 @@
         <w:pStyle w:val="ListBullet"/>
       </w:pPr>
       <w:r>
-        <w:t>Calculado con N25 Valves Sizing 0.10.0 de INSTRUMATIK S.A.S.. Software independiente de fabricantes.</w:t>
+        <w:t>Calculado con N25 Valves Sizing 0.10.1 de INSTRUMATIK S.A.S.. Software independiente de fabricantes.</w:t>
       </w:r>
     </w:p>
     <w:sectPr>
@@ -18316,7 +18316,7 @@
       <w:rPr>
         <w:sz w:val="16"/>
       </w:rPr>
-      <w:t xml:space="preserve">N25 Valves Sizing 0.10.0 · Página </w:t>
+      <w:t xml:space="preserve">N25 Valves Sizing 0.10.1 · Página </w:t>
     </w:r>
     <w:r>
       <w:fldChar w:fldCharType="begin"/>

</xml_diff>

<commit_message>
v0.13.2: config dinámica de la jaula con textos cortos y celda alineada
- Celdas de la solapa 2 del mismo ancho (330 px), incluida la config dinámica.
- Anticavitación: «s/cav hasta Kapp …»; antiruido: «at … dB(A)». Los documentos y la descripción
  emergente conservan el texto completo.
- Proyectos guardados con la redacción anterior se reconocen al abrirlos.

Co-Authored-By: Claude Opus 5.5 <noreply@anthropic.com>
Claude-Session: https://claude.ai/code/session_01U4yJ7uLSXttFganqs6AWmH
</commit_message>
<xml_diff>
--- a/kit_workshop/resultados_de_referencia/Caso_A_baja_agua_enfriamiento_mariposa_resultados_N25.docx
+++ b/kit_workshop/resultados_de_referencia/Caso_A_baja_agua_enfriamiento_mariposa_resultados_N25.docx
@@ -18318,7 +18318,7 @@
         <w:pStyle w:val="ListBullet"/>
       </w:pPr>
       <w:r>
-        <w:t>Calculado con N25 Valves Sizing 0.13.0 de INSTRUMATIK S.A.S.. Software independiente de fabricantes.</w:t>
+        <w:t>Calculado con N25 Valves Sizing 0.13.2 de INSTRUMATIK S.A.S.. Software independiente de fabricantes.</w:t>
       </w:r>
     </w:p>
     <w:sectPr>
@@ -18344,7 +18344,7 @@
       <w:rPr>
         <w:sz w:val="16"/>
       </w:rPr>
-      <w:t xml:space="preserve">N25 Valves Sizing 0.13.0 · Página </w:t>
+      <w:t xml:space="preserve">N25 Valves Sizing 0.13.2 · Página </w:t>
     </w:r>
     <w:r>
       <w:fldChar w:fldCharType="begin"/>

</xml_diff>

<commit_message>
v0.15.0: barra de herramientas rápidas y contacto en el encabezado
Conversor de unidades, propiedades de fluidos y tabla de vapor, tablas de tubería,
presión-temperatura B16.34, biblioteca de materiales, calculadoras y enlaces
editables; WhatsApp, LinkedIn y web de INSTRUMATIK. Menú Herramientas y ayuda.

Co-Authored-By: Claude Opus 5.5 <noreply@anthropic.com>
Claude-Session: https://claude.ai/code/session_01U4yJ7uLSXttFganqs6AWmH
</commit_message>
<xml_diff>
--- a/kit_workshop/resultados_de_referencia/Caso_A_baja_agua_enfriamiento_mariposa_resultados_N25.docx
+++ b/kit_workshop/resultados_de_referencia/Caso_A_baja_agua_enfriamiento_mariposa_resultados_N25.docx
@@ -18828,7 +18828,7 @@
         <w:pStyle w:val="ListBullet"/>
       </w:pPr>
       <w:r>
-        <w:t>Calculado con N25 Valves Sizing 0.14.1 de INSTRUMATIK S.A.S.. Software independiente de fabricantes.</w:t>
+        <w:t>Calculado con N25 Valves Sizing 0.15.0 de INSTRUMATIK S.A.S.. Software independiente de fabricantes.</w:t>
       </w:r>
     </w:p>
     <w:sectPr>
@@ -18854,7 +18854,7 @@
       <w:rPr>
         <w:sz w:val="16"/>
       </w:rPr>
-      <w:t xml:space="preserve">N25 Valves Sizing 0.14.1 · Página </w:t>
+      <w:t xml:space="preserve">N25 Valves Sizing 0.15.0 · Página </w:t>
     </w:r>
     <w:r>
       <w:fldChar w:fldCharType="begin"/>

</xml_diff>

<commit_message>
v0.15.1: Cv rápido (líquido, gas y vapor de agua) y tabla de constantes N
Verificación directa de Cv y Kv con FL, xT, FP, FLP y xTP cargados, con el mismo
módulo IEC 60534-2-1 del cálculo; tabla de constantes N con Kv y Cv.

Co-Authored-By: Claude Opus 5.5 <noreply@anthropic.com>
Claude-Session: https://claude.ai/code/session_01U4yJ7uLSXttFganqs6AWmH
</commit_message>
<xml_diff>
--- a/kit_workshop/resultados_de_referencia/Caso_A_baja_agua_enfriamiento_mariposa_resultados_N25.docx
+++ b/kit_workshop/resultados_de_referencia/Caso_A_baja_agua_enfriamiento_mariposa_resultados_N25.docx
@@ -18828,7 +18828,7 @@
         <w:pStyle w:val="ListBullet"/>
       </w:pPr>
       <w:r>
-        <w:t>Calculado con N25 Valves Sizing 0.15.0 de INSTRUMATIK S.A.S.. Software independiente de fabricantes.</w:t>
+        <w:t>Calculado con N25 Valves Sizing 0.15.1 de INSTRUMATIK S.A.S.. Software independiente de fabricantes.</w:t>
       </w:r>
     </w:p>
     <w:sectPr>
@@ -18854,7 +18854,7 @@
       <w:rPr>
         <w:sz w:val="16"/>
       </w:rPr>
-      <w:t xml:space="preserve">N25 Valves Sizing 0.15.0 · Página </w:t>
+      <w:t xml:space="preserve">N25 Valves Sizing 0.15.1 · Página </w:t>
     </w:r>
     <w:r>
       <w:fldChar w:fldCharType="begin"/>

</xml_diff>

<commit_message>
v0.15.2: factores típicos de válvula, SG y tabla de fluidos
Nuevo botón con FL, xT, Fd, Kc, característica y rangeabilidad de cada estilo y
de las jaulas anticavitación y antiruido; SG del líquido y del gas en
Propiedades de fluidos; pestaña con los 28 fluidos de la biblioteca.

Co-Authored-By: Claude Opus 5.5 <noreply@anthropic.com>
Claude-Session: https://claude.ai/code/session_01U4yJ7uLSXttFganqs6AWmH
</commit_message>
<xml_diff>
--- a/kit_workshop/resultados_de_referencia/Caso_A_baja_agua_enfriamiento_mariposa_resultados_N25.docx
+++ b/kit_workshop/resultados_de_referencia/Caso_A_baja_agua_enfriamiento_mariposa_resultados_N25.docx
@@ -18828,7 +18828,7 @@
         <w:pStyle w:val="ListBullet"/>
       </w:pPr>
       <w:r>
-        <w:t>Calculado con N25 Valves Sizing 0.15.1 de INSTRUMATIK S.A.S.. Software independiente de fabricantes.</w:t>
+        <w:t>Calculado con N25 Valves Sizing 0.15.2 de INSTRUMATIK S.A.S.. Software independiente de fabricantes.</w:t>
       </w:r>
     </w:p>
     <w:sectPr>
@@ -18854,7 +18854,7 @@
       <w:rPr>
         <w:sz w:val="16"/>
       </w:rPr>
-      <w:t xml:space="preserve">N25 Valves Sizing 0.15.1 · Página </w:t>
+      <w:t xml:space="preserve">N25 Valves Sizing 0.15.2 · Página </w:t>
     </w:r>
     <w:r>
       <w:fldChar w:fldCharType="begin"/>

</xml_diff>